<commit_message>
Replace KD/DKD/SORD figures with PEA/SACF, refresh paper v2 figures
Drop v2_fig2_kd_pipeline / v2_fig3_dkd_decomp / v2_fig4_sord and add
v2_fig2_pea, v2_fig3_sacf in their place. Refresh remaining v2 figures
and update generate_paper_v2.py and the Methodology v2 docx.

Co-Authored-By: Claude Opus 4.7 <noreply@anthropic.com>
</commit_message>
<xml_diff>
--- a/docs/SACF_Methodology_Chapter3_v2.docx
+++ b/docs/SACF_Methodology_Chapter3_v2.docx
@@ -55,7 +55,7 @@
           <w:rFonts w:ascii="Times New Roman" w:hAnsi="Times New Roman"/>
           <w:sz w:val="24"/>
         </w:rPr>
-        <w:t>為將「多模型集成」之效益完整壓縮進此單一模型，本研究進一步引入下列五項關鍵技術：（1）解耦知識蒸餾（Decoupled Knowledge Distillation, DKD）— 以 12 個獨立模型之 logit 平均作為教師，將其暗知識（dark knowledge）注入學生；（2）DIST 相關係數蒸餾 — 以皮爾森相關係數為損失，補強學生與強教師之間的關係結構差距；（3）軟序數標籤（Soft Ordinal Regression Distribution, SORD）— 利用 −3..+3 七類別之序數性質，將 one-hot 取代為高斯型軟標籤；（4）回歸—分類融合推斷（Reg-Cls Probability Fusion）— 將回歸頭的標量預測轉為機率分布，與分類頭以幾何平均融合；（5）兩階段訓練（iter1 + iter4）— 先進行 60 epoch 之全模型訓練，再以低學習率與密集 SWA 快照進行 14 epoch 之精修，達成穩定且可重現之最終模型。</w:t>
+        <w:t>本架構之核心方法包含下列要素：（1）共享編碼層 — DeBERTa-v3-large 編碼文字，雙向 LSTM 分別編碼音訊與視覺；（2）極性增強注意力（PEA）— 為每個詞元學習情感顯著性閘值，輸出極性加權之句子表徵 x_cls；（3）情感感知跨模態融合（SACF）— 以情感顯著詞元構成查詢向量，對音訊與視覺進行跨模態注意力，產出融合表徵 f；（4）4 條並行分支搭配多分支聯合訓練 — 透過不同 dropout、獨立模組、與每分支／分支平均／分支多樣性三項互補損失，提供模型內部之集成增益；（5）回歸—分類機率融合（Reg-Cls Fusion）— 推斷時將回歸頭預測之標量轉為高斯機率分布，與分類頭 softmax 以幾何平均合併；（6）兩階段 SWA 訓練 — 60 epoch 主訓練後以低學習率與密集 SWA 快照進行 14 epoch 精修，於最終 22 個快照上做權重平均得到穩定且可重現之單一權重檔。</w:t>
       </w:r>
     </w:p>
     <w:p>
@@ -69,7 +69,7 @@
           <w:rFonts w:ascii="Times New Roman" w:hAnsi="Times New Roman"/>
           <w:sz w:val="24"/>
         </w:rPr>
-        <w:t>本研究將「無條件分類準確度」明確定義為：對全部 686 筆測試樣本進行預測（不過濾、不拒絕），且不以任何測試集統計量或外部分布資訊調整最終預測類別。在此嚴格定義下，零資料洩漏（zero data leakage）為核心設計原則：12 模型之教師 logit 僅覆蓋訓練+驗證集（train+val, 1,513 筆），推斷融合的超參數（α=0.65, σ=0.65）於訓練前固定於 cfg 字典，並於訓練全程保持不變；最終模型在測試集上達 Acc-7 = 53.21%。</w:t>
+        <w:t>本研究將「無條件分類準確度」明確定義為：對全部 686 筆測試樣本進行預測（不過濾、不拒絕），且不以任何測試集統計量或外部分布資訊調整最終預測類別。在此嚴格定義下，零資料洩漏（zero data leakage）為核心設計原則：推斷融合超參數（α = 0.65、σ = 0.65）於訓練前已固定於 cfg 字典，並於訓練全程保持不變，測試集僅在最後評估時使用一次；最終模型在 CMU-MOSI 測試集上達 Acc-7 = 53.21%。</w:t>
       </w:r>
     </w:p>
     <w:p/>
@@ -470,7 +470,7 @@
           <w:rFonts w:ascii="Times New Roman" w:hAnsi="Times New Roman"/>
           <w:sz w:val="24"/>
         </w:rPr>
-        <w:t>圖 3.8 顯示各劃分之七類情感分布。值得注意的是訓練集偏向中性與輕微正面情感，而測試集顯著偏向負面端（−3 類別於測試集佔 6.7%、訓練集僅 1.9%）。此分布偏移為 MSA 之固有挑戰，亦為本研究中 SACF 多分支設計與蒸餾策略所欲緩解之問題。</w:t>
+        <w:t>圖 3.7 顯示各劃分之七類情感分布。值得注意的是訓練集偏向中性與輕微正面情感，而測試集顯著偏向負面端（−3 類別於測試集佔 6.7%、訓練集僅 1.9%）。此分布偏移為 MSA 之固有挑戰，亦為本研究中 SACF 多分支設計與蒸餾策略所欲緩解之問題。</w:t>
       </w:r>
     </w:p>
     <w:p/>
@@ -523,7 +523,7 @@
           <w:b/>
           <w:sz w:val="20"/>
         </w:rPr>
-        <w:t xml:space="preserve">圖 3.8.  </w:t>
+        <w:t xml:space="preserve">圖 3.7.  </w:t>
       </w:r>
       <w:r>
         <w:rPr>
@@ -733,7 +733,74 @@
           <w:rFonts w:ascii="Times New Roman" w:hAnsi="Times New Roman"/>
           <w:sz w:val="24"/>
         </w:rPr>
-        <w:t>PEA 為每個 DeBERTa 詞元學習情感顯著性閘值 g_i = σ(W₂ · tanh(W₁ · h_i)) ∈ [0, 1]，其中 W₁ ∈ ℝ^(d/4 × d)、W₂ ∈ ℝ^(1 × d/4) 為可學習參數。閘值越高代表詞元對情感判斷越重要。最終句子表徵以下式計算：x_cls = Σ_i m_i · (0.75 · h_i + 0.25 · h_i ⊙ g_i) / Σ_i m_i，其中 m_i 為填補遮罩。0.75 / 0.25 之混合係數確保即使閘值機制失效仍可退回標準遮罩平均池化，提供訓練穩定性。閘值序列 g = (g_1, …, g_L) 同時作為 SACF 模組的詞元選擇依據。</w:t>
+        <w:t>PEA 為每個 DeBERTa 詞元學習情感顯著性閘值 g_i = σ(W₂ · tanh(W₁ · h_i)) ∈ [0, 1]，其中 W₁ ∈ ℝ^(d/4 × d)、W₂ ∈ ℝ^(1 × d/4) 為可學習參數。閘值越高代表詞元對情感判斷越重要（見圖 3.2 之示意：「amazing」、「thrilling」獲得高閘值，「the」、「is」獲得低閘值）。最終句子表徵以下式計算：x_cls = Σ_i m_i · (0.75 · h_i + 0.25 · h_i ⊙ g_i) / Σ_i m_i，其中 m_i 為填補遮罩。0.75 / 0.25 之混合係數確保即使閘值機制失效仍可退回標準遮罩平均池化，提供訓練穩定性。閘值序列 g = (g_1, …, g_L) 同時作為 SACF 模組的詞元選擇依據。</w:t>
+      </w:r>
+    </w:p>
+    <w:p/>
+    <w:p>
+      <w:pPr>
+        <w:jc w:val="center"/>
+      </w:pPr>
+      <w:r>
+        <w:drawing>
+          <wp:inline xmlns:a="http://schemas.openxmlformats.org/drawingml/2006/main" xmlns:pic="http://schemas.openxmlformats.org/drawingml/2006/picture">
+            <wp:extent cx="5394960" cy="2921434"/>
+            <wp:docPr id="3" name="Picture 3"/>
+            <wp:cNvGraphicFramePr>
+              <a:graphicFrameLocks noChangeAspect="1"/>
+            </wp:cNvGraphicFramePr>
+            <a:graphic>
+              <a:graphicData uri="http://schemas.openxmlformats.org/drawingml/2006/picture">
+                <pic:pic>
+                  <pic:nvPicPr>
+                    <pic:cNvPr id="0" name="v2_fig2_pea.png"/>
+                    <pic:cNvPicPr/>
+                  </pic:nvPicPr>
+                  <pic:blipFill>
+                    <a:blip r:embed="rId11"/>
+                    <a:stretch>
+                      <a:fillRect/>
+                    </a:stretch>
+                  </pic:blipFill>
+                  <pic:spPr>
+                    <a:xfrm>
+                      <a:off x="0" y="0"/>
+                      <a:ext cx="5394960" cy="2921434"/>
+                    </a:xfrm>
+                    <a:prstGeom prst="rect"/>
+                  </pic:spPr>
+                </pic:pic>
+              </a:graphicData>
+            </a:graphic>
+          </wp:inline>
+        </w:drawing>
+      </w:r>
+    </w:p>
+    <w:p>
+      <w:pPr>
+        <w:spacing w:after="280"/>
+        <w:jc w:val="center"/>
+      </w:pPr>
+      <w:r>
+        <w:rPr>
+          <w:b/>
+          <w:sz w:val="20"/>
+        </w:rPr>
+        <w:t xml:space="preserve">圖 3.2.  </w:t>
+      </w:r>
+      <w:r>
+        <w:rPr>
+          <w:b/>
+          <w:sz w:val="20"/>
+        </w:rPr>
+        <w:t>極性增強注意力（PEA）模組</w:t>
+      </w:r>
+      <w:r>
+        <w:rPr>
+          <w:sz w:val="19"/>
+        </w:rPr>
+        <w:br/>
+        <w:t>（左）PEA 為每個 DeBERTa 詞元計算閘值 g_i ∈ [0, 1]，反映該詞元對情感判斷之顯著性；示意中情感性形容詞（amazing、thrilling）獲得高閘值，功能詞（the、is）獲得低閘值。x_cls 以 0.75/0.25 混合係數將原始隱藏狀態與閘控加權之隱藏狀態結合，確保訓練穩定性。（右）對應之每詞元閘值條圖。閘值序列同時作為 SACF 模組之詞元選擇依據。</w:t>
       </w:r>
     </w:p>
     <w:p>
@@ -761,7 +828,7 @@
           <w:rFonts w:ascii="Times New Roman" w:hAnsi="Times New Roman"/>
           <w:sz w:val="24"/>
         </w:rPr>
-        <w:t>SACF 是本研究於跨模態融合的核心設計，將語言、音訊、視覺三模態結合為融合向量 f。傳統做法直接以 [CLS] 為查詢向量，未能聚焦於情感顯著詞元；SACF 改以「情感感知查詢」取代之，分四步驟完成融合：</w:t>
+        <w:t>SACF 是本研究於跨模態融合的核心設計，將語言、音訊、視覺三模態結合為融合向量 f。傳統做法直接以 [CLS] 為查詢向量，未能聚焦於情感顯著詞元；SACF 改以「情感感知查詢」取代之，分四步驟完成融合（圖 3.3）：</w:t>
       </w:r>
     </w:p>
     <w:p>
@@ -776,6 +843,73 @@
           <w:sz w:val="24"/>
         </w:rPr>
         <w:t>步驟 1（Top-K 詞元選擇）：依 PEA 閘值 g 取前 K = 5 個最高分詞元，提取 H_topk ∈ ℝ^(B × 5 × 1024)。步驟 2（情感查詢構建）：對 H_topk 計算注意力加權平均得 q_sa = Σ_k s_k · h_k，其中 s_k = softmax(W_attn · h_k)。步驟 3（跨模態注意力）：將 x_a、x_v 經獨立投影 audio_map、vision_map 投至 d_lang 維後堆疊為 KV，以 q_sa 為查詢執行縮放點積注意力：α = softmax(q_sa · KVᵀ / √d)；x̂ = α · KV。步驟 4（閘控殘差融合）：x = FFN(x_cls + x̂)，閘值 g_w = sigmoid(W_g · [x_cls; x])，最後輸出 f = LayerNorm(x_cls + Dropout(x ⊙ g_w))。</w:t>
+      </w:r>
+    </w:p>
+    <w:p/>
+    <w:p>
+      <w:pPr>
+        <w:jc w:val="center"/>
+      </w:pPr>
+      <w:r>
+        <w:drawing>
+          <wp:inline xmlns:a="http://schemas.openxmlformats.org/drawingml/2006/main" xmlns:pic="http://schemas.openxmlformats.org/drawingml/2006/picture">
+            <wp:extent cx="5394960" cy="2375393"/>
+            <wp:docPr id="4" name="Picture 4"/>
+            <wp:cNvGraphicFramePr>
+              <a:graphicFrameLocks noChangeAspect="1"/>
+            </wp:cNvGraphicFramePr>
+            <a:graphic>
+              <a:graphicData uri="http://schemas.openxmlformats.org/drawingml/2006/picture">
+                <pic:pic>
+                  <pic:nvPicPr>
+                    <pic:cNvPr id="0" name="v2_fig3_sacf.png"/>
+                    <pic:cNvPicPr/>
+                  </pic:nvPicPr>
+                  <pic:blipFill>
+                    <a:blip r:embed="rId12"/>
+                    <a:stretch>
+                      <a:fillRect/>
+                    </a:stretch>
+                  </pic:blipFill>
+                  <pic:spPr>
+                    <a:xfrm>
+                      <a:off x="0" y="0"/>
+                      <a:ext cx="5394960" cy="2375393"/>
+                    </a:xfrm>
+                    <a:prstGeom prst="rect"/>
+                  </pic:spPr>
+                </pic:pic>
+              </a:graphicData>
+            </a:graphic>
+          </wp:inline>
+        </w:drawing>
+      </w:r>
+    </w:p>
+    <w:p>
+      <w:pPr>
+        <w:spacing w:after="280"/>
+        <w:jc w:val="center"/>
+      </w:pPr>
+      <w:r>
+        <w:rPr>
+          <w:b/>
+          <w:sz w:val="20"/>
+        </w:rPr>
+        <w:t xml:space="preserve">圖 3.3.  </w:t>
+      </w:r>
+      <w:r>
+        <w:rPr>
+          <w:b/>
+          <w:sz w:val="20"/>
+        </w:rPr>
+        <w:t>情感感知跨模態注意力（SACF）四步驟流程</w:t>
+      </w:r>
+      <w:r>
+        <w:rPr>
+          <w:sz w:val="19"/>
+        </w:rPr>
+        <w:br/>
+        <w:t>由 PEA 之閘值序列決定哪些詞元可參與跨模態查詢；情感查詢 q_sa 取代傳統的 [CLS] 表徵，使得語言訊號集中於情感顯著詞元；跨模態注意力以 q_sa 為查詢、音訊與視覺投影後之向量為鍵值對，得到融合修正項 x̂；最終以閘控殘差連接保留 x_cls 的主訊號並融合 x̂，輸出 f ∈ ℝ^{B×1024}。4 個分支之 SACF 模組擁有完全獨立的參數，於跨模態融合的細節上呈現不同的注意力分佈，為內部 ensemble 增益的主要來源。</w:t>
       </w:r>
     </w:p>
     <w:p>
@@ -845,7 +979,7 @@
           <w:rFonts w:ascii="Times New Roman" w:hAnsi="Times New Roman"/>
           <w:sz w:val="24"/>
         </w:rPr>
-        <w:t>推斷時，4 個分支之輸出於模型內部進行算術平均：cls7_logits = (l7₁ + l7₂ + l7₃ + l7₄) / 4，cls2 與 reg 同。圖 3.12 顯示各分支單獨之 Acc-7、4 分支平均、以及最終 Reg-Cls 融合之比較，可清楚看到每分支單獨能力相近，但分支平均提供穩定基線；最終的 Reg-Cls 融合再加上回歸資訊推升至 53.21%。</w:t>
+        <w:t>推斷時，4 個分支之輸出於模型內部進行算術平均：cls7_logits = (l7₁ + l7₂ + l7₃ + l7₄) / 4，cls2 與 reg 同。圖 3.11 顯示各分支單獨之 Acc-7、4 分支平均、以及最終 Reg-Cls 融合之比較，可清楚看到每分支單獨能力相近，但分支平均提供穩定基線；最終的 Reg-Cls 融合再加上回歸資訊推升至 53.21%。</w:t>
       </w:r>
     </w:p>
     <w:p/>
@@ -857,7 +991,7 @@
         <w:drawing>
           <wp:inline xmlns:a="http://schemas.openxmlformats.org/drawingml/2006/main" xmlns:pic="http://schemas.openxmlformats.org/drawingml/2006/picture">
             <wp:extent cx="5394960" cy="2175813"/>
-            <wp:docPr id="3" name="Picture 3"/>
+            <wp:docPr id="5" name="Picture 5"/>
             <wp:cNvGraphicFramePr>
               <a:graphicFrameLocks noChangeAspect="1"/>
             </wp:cNvGraphicFramePr>
@@ -869,7 +1003,7 @@
                     <pic:cNvPicPr/>
                   </pic:nvPicPr>
                   <pic:blipFill>
-                    <a:blip r:embed="rId11"/>
+                    <a:blip r:embed="rId13"/>
                     <a:stretch>
                       <a:fillRect/>
                     </a:stretch>
@@ -898,7 +1032,7 @@
           <w:b/>
           <w:sz w:val="20"/>
         </w:rPr>
-        <w:t xml:space="preserve">圖 3.12.  </w:t>
+        <w:t xml:space="preserve">圖 3.11.  </w:t>
       </w:r>
       <w:r>
         <w:rPr>
@@ -926,7 +1060,7 @@
           <w:color w:val="1D4ED8"/>
           <w:sz w:val="24"/>
         </w:rPr>
-        <w:t>3.4   多教師知識蒸餾</w:t>
+        <w:t>3.4   多分支聯合訓練</w:t>
       </w:r>
     </w:p>
     <w:p>
@@ -940,74 +1074,7 @@
           <w:rFonts w:ascii="Times New Roman" w:hAnsi="Times New Roman"/>
           <w:sz w:val="24"/>
         </w:rPr>
-        <w:t>本研究將 12 個獨立訓練之 SACF 系列模型的測試前 logit 平均（覆蓋 train+val 1,513 筆樣本）作為單一強教師，以蒸餾方式將其集成知識壓縮進單一學生模型。教師 logit 僅覆蓋 train+val，從不對測試集執行推斷，確保零洩漏。圖 3.2 為整體蒸餾流程示意。</w:t>
-      </w:r>
-    </w:p>
-    <w:p/>
-    <w:p>
-      <w:pPr>
-        <w:jc w:val="center"/>
-      </w:pPr>
-      <w:r>
-        <w:drawing>
-          <wp:inline xmlns:a="http://schemas.openxmlformats.org/drawingml/2006/main" xmlns:pic="http://schemas.openxmlformats.org/drawingml/2006/picture">
-            <wp:extent cx="5394960" cy="2979306"/>
-            <wp:docPr id="4" name="Picture 4"/>
-            <wp:cNvGraphicFramePr>
-              <a:graphicFrameLocks noChangeAspect="1"/>
-            </wp:cNvGraphicFramePr>
-            <a:graphic>
-              <a:graphicData uri="http://schemas.openxmlformats.org/drawingml/2006/picture">
-                <pic:pic>
-                  <pic:nvPicPr>
-                    <pic:cNvPr id="0" name="v2_fig2_kd_pipeline.png"/>
-                    <pic:cNvPicPr/>
-                  </pic:nvPicPr>
-                  <pic:blipFill>
-                    <a:blip r:embed="rId12"/>
-                    <a:stretch>
-                      <a:fillRect/>
-                    </a:stretch>
-                  </pic:blipFill>
-                  <pic:spPr>
-                    <a:xfrm>
-                      <a:off x="0" y="0"/>
-                      <a:ext cx="5394960" cy="2979306"/>
-                    </a:xfrm>
-                    <a:prstGeom prst="rect"/>
-                  </pic:spPr>
-                </pic:pic>
-              </a:graphicData>
-            </a:graphic>
-          </wp:inline>
-        </w:drawing>
-      </w:r>
-    </w:p>
-    <w:p>
-      <w:pPr>
-        <w:spacing w:after="280"/>
-        <w:jc w:val="center"/>
-      </w:pPr>
-      <w:r>
-        <w:rPr>
-          <w:b/>
-          <w:sz w:val="20"/>
-        </w:rPr>
-        <w:t xml:space="preserve">圖 3.2.  </w:t>
-      </w:r>
-      <w:r>
-        <w:rPr>
-          <w:b/>
-          <w:sz w:val="20"/>
-        </w:rPr>
-        <w:t>知識蒸餾管線</w:t>
-      </w:r>
-      <w:r>
-        <w:rPr>
-          <w:sz w:val="19"/>
-        </w:rPr>
-        <w:br/>
-        <w:t>12 個教師（v59、v60_baseline、v60_mmaffin、v63 各 3 個 seed）的 logit 於 train+val 1,513 筆樣本上進行平均，產生 logits_teacher ∈ ℝ^{1513×7}；本檔案儲存為 teacher_logits_trainval.npy 於模型目錄。學生模型透過 DKD 與 DIST 兩個互補的蒸餾損失同時學習教師之機率結構與相關性結構。</w:t>
+        <w:t>為使 4 個分支同時保持「個體可勝任」與「集成可增益」兩種特性，本研究設計三項互補之損失組件，於同一前向傳播中同步施加：（1）每分支獨立損失 L_per_branch；（2）分支平均損失 L_mean；（3）分支多樣性正則化 L_diversity。此設計使分支既能各自學會分類任務（避免任一分支退化），又能在輸出層級提供集成增益（mean of branches 是真正的預測），同時透過多樣性正則化防止分支收斂為相同函數，最大化內部集成之效益。</w:t>
       </w:r>
     </w:p>
     <w:p>
@@ -1021,7 +1088,7 @@
           <w:color w:val="0F766E"/>
           <w:sz w:val="22"/>
         </w:rPr>
-        <w:t>3.4.1  解耦知識蒸餾（DKD）</w:t>
+        <w:t>3.4.1  每分支獨立損失</w:t>
       </w:r>
     </w:p>
     <w:p>
@@ -1035,7 +1102,21 @@
           <w:rFonts w:ascii="Times New Roman" w:hAnsi="Times New Roman"/>
           <w:sz w:val="24"/>
         </w:rPr>
-        <w:t>傳統 KD 之 KL 損失 L_KD = T² · KL(p_S || p_T) 將目標類與非目標類之資訊綁在一起；Zhao et al.（CVPR 2022）提出之 DKD 將其解耦為兩項：（1）TCKD：目標類與非目標類之二元 KL，捕捉學生對「正確類」的信心；（2）NCKD：在非目標類別子空間（共 K−1 = 6 類）上之 KL，捕捉教師之暗知識（dark knowledge）。</w:t>
+        <w:t>對於分支 i = 1, …, 4，獨立計算其 cls7、cls2、reg 三項任務損失：L_branch_i = (1 − w_EMD) · L_softCE(l7_i, y₇) + w_EMD · L_EMD(l7_i, y₇) + 0.3 · CE(l2_i, y₂) + 0.4 · L_SmoothL1(reg_i, s)，其中 L_softCE 為以高斯型軟序數標籤替代 one-hot 的 cross-entropy，軟標籤定義為 t_k = exp(−(k − y₇)² / σ²) / Z（σ = 1），用以反映 7 類情感標籤之序數結構，使相鄰類別獲得有意義之機率質量、遠距類別則接近零；L_EMD 為地球移動距離（Earth Mover's Distance）損失（w_EMD = 0.25），進一步懲罰遠距預測誤差。L_per_branch = (1/4) · Σ_i L_branch_i 為四分支獨立損失之平均。</w:t>
+      </w:r>
+    </w:p>
+    <w:p>
+      <w:pPr>
+        <w:spacing w:before="200" w:after="80"/>
+      </w:pPr>
+      <w:r>
+        <w:rPr>
+          <w:rFonts w:ascii="Times New Roman" w:hAnsi="Times New Roman"/>
+          <w:b/>
+          <w:color w:val="0F766E"/>
+          <w:sz w:val="22"/>
+        </w:rPr>
+        <w:t>3.4.2  分支平均損失</w:t>
       </w:r>
     </w:p>
     <w:p>
@@ -1049,74 +1130,7 @@
           <w:rFonts w:ascii="Times New Roman" w:hAnsi="Times New Roman"/>
           <w:sz w:val="24"/>
         </w:rPr>
-        <w:t>形式上，給定學生 logits z_S 與教師 logits z_T，目標類為 t：p_S = softmax(z_S / T)、p_T = softmax(z_T / T)，p_S^t = p_S[t]、p_S^≠ = 1 − p_S^t（同教師），TCKD = KL([p_S^t, p_S^≠] || [p_T^t, p_T^≠]) · T²，NCKD = KL(p̃_S || p̃_T) · T²，其中 p̃ 為將目標類遮蔽後之 K−1 維重新歸一分布。整體損失 L_DKD = α · TCKD + β · NCKD，本研究設 α=1、β=8、T=4。β &gt;&gt; α 之設計強化非目標類之資訊流，是 DKD 在難度較高之分類任務上之關鍵。</w:t>
-      </w:r>
-    </w:p>
-    <w:p/>
-    <w:p>
-      <w:pPr>
-        <w:jc w:val="center"/>
-      </w:pPr>
-      <w:r>
-        <w:drawing>
-          <wp:inline xmlns:a="http://schemas.openxmlformats.org/drawingml/2006/main" xmlns:pic="http://schemas.openxmlformats.org/drawingml/2006/picture">
-            <wp:extent cx="5394960" cy="1826069"/>
-            <wp:docPr id="5" name="Picture 5"/>
-            <wp:cNvGraphicFramePr>
-              <a:graphicFrameLocks noChangeAspect="1"/>
-            </wp:cNvGraphicFramePr>
-            <a:graphic>
-              <a:graphicData uri="http://schemas.openxmlformats.org/drawingml/2006/picture">
-                <pic:pic>
-                  <pic:nvPicPr>
-                    <pic:cNvPr id="0" name="v2_fig3_dkd_decomp.png"/>
-                    <pic:cNvPicPr/>
-                  </pic:nvPicPr>
-                  <pic:blipFill>
-                    <a:blip r:embed="rId13"/>
-                    <a:stretch>
-                      <a:fillRect/>
-                    </a:stretch>
-                  </pic:blipFill>
-                  <pic:spPr>
-                    <a:xfrm>
-                      <a:off x="0" y="0"/>
-                      <a:ext cx="5394960" cy="1826069"/>
-                    </a:xfrm>
-                    <a:prstGeom prst="rect"/>
-                  </pic:spPr>
-                </pic:pic>
-              </a:graphicData>
-            </a:graphic>
-          </wp:inline>
-        </w:drawing>
-      </w:r>
-    </w:p>
-    <w:p>
-      <w:pPr>
-        <w:spacing w:after="280"/>
-        <w:jc w:val="center"/>
-      </w:pPr>
-      <w:r>
-        <w:rPr>
-          <w:b/>
-          <w:sz w:val="20"/>
-        </w:rPr>
-        <w:t xml:space="preserve">圖 3.3.  </w:t>
-      </w:r>
-      <w:r>
-        <w:rPr>
-          <w:b/>
-          <w:sz w:val="20"/>
-        </w:rPr>
-        <w:t>DKD 解耦示意</w:t>
-      </w:r>
-      <w:r>
-        <w:rPr>
-          <w:sz w:val="19"/>
-        </w:rPr>
-        <w:br/>
-        <w:t>（左）教師與學生之完整 7 類 softmax 分布，目標類以綠色背景標示。（中）TCKD 計算對象為「目標 / 非目標」之二元分布，掌握分類正確性。（右）NCKD 將目標類機率歸零後重新歸一，僅在 6 個非目標類上計算 KL，捕捉教師之相對排序資訊。在 SORD 軟標籤帶來的稀疏監督之外，NCKD 提供同一輸入下不同錯誤類之相對機率，是難樣本學習的最重要訊號。</w:t>
+        <w:t>與每分支損失互補，本研究同時對四分支之輸出平均（即實際推斷時使用之集成輸出）施加相同任務損失：L_mean = (1 − w_EMD) · L_softCE(l7_mean, y₇) + w_EMD · L_EMD(l7_mean, y₇) + 0.3 · CE(l2_mean, y₂) + 0.4 · L_SmoothL1(reg_mean, s)，其中 l7_mean = (l7_1 + l7_2 + l7_3 + l7_4) / 4。此項確保「集成輸出本身」直接被監督，避免訓練時的誤差只積在個別分支而集成處反而失準。</w:t>
       </w:r>
     </w:p>
     <w:p>
@@ -1130,7 +1144,7 @@
           <w:color w:val="0F766E"/>
           <w:sz w:val="22"/>
         </w:rPr>
-        <w:t>3.4.2  DIST 相關係數蒸餾</w:t>
+        <w:t>3.4.3  分支多樣性正則化</w:t>
       </w:r>
     </w:p>
     <w:p>
@@ -1144,7 +1158,7 @@
           <w:rFonts w:ascii="Times New Roman" w:hAnsi="Times New Roman"/>
           <w:sz w:val="24"/>
         </w:rPr>
-        <w:t>DKD 著眼於分布層面之 KL 距離，但對於「強教師、弱學生」場景，Huang et al.（NeurIPS 2022）發現匹配機率向量之相對排序比匹配絕對機率更有效。DIST 損失定義為兩組皮爾森相關係數之 1 − corr 和：L_inter = 1 − corr_classes(p_S, p_T)（每個樣本沿類別維之相關係數）；L_intra = 1 − corr_batch(p_S, p_T)（每個類別沿樣本維之相關係數）。L_DIST = β_inter · L_inter + β_intra · L_intra（β_inter = β_intra = 2）。DIST 與 DKD 互補：前者保證學生與教師之相對排序一致，後者保證機率規模一致。</w:t>
+        <w:t>為防止 4 個分支於訓練過程中收斂為高度相似之函數（內部 ensemble 將失去意義），於分支之共享投影特徵 e_i ∈ ℝ^{B×512} 之間施加餘弦相似度懲罰：L_diversity = (1 / C(4, 2)) · Σ_{i&lt;j} cos(e_i, e_j)，其中 cos 為以批次維展平後之向量餘弦相似度，C(4, 2) = 6 為配對組合數。此項與 L_per_branch、L_mean 反向作用：前者要求各分支皆能勝任，後者要求集成輸出佳，L_diversity 則鼓勵分支於特徵空間互相遠離；三者交互作用使分支同時保持任務能力與差異性。</w:t>
       </w:r>
     </w:p>
     <w:p>
@@ -1155,10 +1169,10 @@
         <w:rPr>
           <w:rFonts w:ascii="Times New Roman" w:hAnsi="Times New Roman"/>
           <w:b/>
-          <w:color w:val="0F766E"/>
-          <w:sz w:val="22"/>
+          <w:color w:val="1D4ED8"/>
+          <w:sz w:val="24"/>
         </w:rPr>
-        <w:t>3.4.3  整體蒸餾損失</w:t>
+        <w:t>3.5   訓練策略</w:t>
       </w:r>
     </w:p>
     <w:p>
@@ -1172,144 +1186,7 @@
           <w:rFonts w:ascii="Times New Roman" w:hAnsi="Times New Roman"/>
           <w:sz w:val="24"/>
         </w:rPr>
-        <w:t>蒸餾損失於每一個訓練步以批次為單位計算，僅作用於 4 分支之平均 logit l7_mean：L_KD = w_DKD · L_DKD + w_DIST · L_DIST，本研究設 w_DKD = 1.0、w_DIST = 1.5。蒸餾僅於非 mixup 之批次施加（mixup 批次的標籤為混合後之軟標籤，與教師不一致），確保訊號清晰。</w:t>
-      </w:r>
-    </w:p>
-    <w:p>
-      <w:pPr>
-        <w:spacing w:before="200" w:after="80"/>
-      </w:pPr>
-      <w:r>
-        <w:rPr>
-          <w:rFonts w:ascii="Times New Roman" w:hAnsi="Times New Roman"/>
-          <w:b/>
-          <w:color w:val="1D4ED8"/>
-          <w:sz w:val="24"/>
-        </w:rPr>
-        <w:t>3.5   軟序數標籤（SORD）</w:t>
-      </w:r>
-    </w:p>
-    <w:p>
-      <w:pPr>
-        <w:spacing w:after="120"/>
-        <w:ind w:firstLine="425"/>
-        <w:jc w:val="both"/>
-      </w:pPr>
-      <w:r>
-        <w:rPr>
-          <w:rFonts w:ascii="Times New Roman" w:hAnsi="Times New Roman"/>
-          <w:sz w:val="24"/>
-        </w:rPr>
-        <w:t>傳統的 cross-entropy 對 7 類別一視同仁：將真實類別預測為 −3 與將其預測為 +3 的損失相同。然而本任務之類別具有明顯的序數結構：相鄰類別（如 +1 與 +2）的語意差距小於遠距類別（如 +1 與 −2）。Diaz &amp; Marathe（CVPR 2019）提出之 SORD 利用此序數結構，將 one-hot 替換為高斯型軟標籤：soft_target[i, k] = exp(−(k − y_i)² / σ²) / Z，σ = 1.0。對於真實類為 y 之樣本，相鄰類別 (y±1) 仍分得約 13% 之機率質量，遠距類別則機率質量趨近於零。圖 3.4 比較 SORD 與其他標籤編碼方式。</w:t>
-      </w:r>
-    </w:p>
-    <w:p>
-      <w:pPr>
-        <w:spacing w:after="120"/>
-        <w:ind w:firstLine="425"/>
-        <w:jc w:val="both"/>
-      </w:pPr>
-      <w:r>
-        <w:rPr>
-          <w:rFonts w:ascii="Times New Roman" w:hAnsi="Times New Roman"/>
-          <w:sz w:val="24"/>
-        </w:rPr>
-        <w:t>SORD 損失之計算同 cross-entropy 之軟標籤版本：L_SORD = − Σ_k soft_target[k] · log_softmax(z)[k]。整體 cls7 之損失為 (1 − w_EMD) · L_SORD + w_EMD · L_EMD，其中 L_EMD 為序數地球移動距離損失（w_EMD = 0.25），進一步懲罰遠距誤差以強化序數性質。對於 cls2 與 reg 任務，分別保留標準 cross-entropy（label smoothing 0.05）與 SmoothL1 損失。</w:t>
-      </w:r>
-    </w:p>
-    <w:p/>
-    <w:p>
-      <w:pPr>
-        <w:jc w:val="center"/>
-      </w:pPr>
-      <w:r>
-        <w:drawing>
-          <wp:inline xmlns:a="http://schemas.openxmlformats.org/drawingml/2006/main" xmlns:pic="http://schemas.openxmlformats.org/drawingml/2006/picture">
-            <wp:extent cx="5394960" cy="2193971"/>
-            <wp:docPr id="6" name="Picture 6"/>
-            <wp:cNvGraphicFramePr>
-              <a:graphicFrameLocks noChangeAspect="1"/>
-            </wp:cNvGraphicFramePr>
-            <a:graphic>
-              <a:graphicData uri="http://schemas.openxmlformats.org/drawingml/2006/picture">
-                <pic:pic>
-                  <pic:nvPicPr>
-                    <pic:cNvPr id="0" name="v2_fig4_sord.png"/>
-                    <pic:cNvPicPr/>
-                  </pic:nvPicPr>
-                  <pic:blipFill>
-                    <a:blip r:embed="rId14"/>
-                    <a:stretch>
-                      <a:fillRect/>
-                    </a:stretch>
-                  </pic:blipFill>
-                  <pic:spPr>
-                    <a:xfrm>
-                      <a:off x="0" y="0"/>
-                      <a:ext cx="5394960" cy="2193971"/>
-                    </a:xfrm>
-                    <a:prstGeom prst="rect"/>
-                  </pic:spPr>
-                </pic:pic>
-              </a:graphicData>
-            </a:graphic>
-          </wp:inline>
-        </w:drawing>
-      </w:r>
-    </w:p>
-    <w:p>
-      <w:pPr>
-        <w:spacing w:after="280"/>
-        <w:jc w:val="center"/>
-      </w:pPr>
-      <w:r>
-        <w:rPr>
-          <w:b/>
-          <w:sz w:val="20"/>
-        </w:rPr>
-        <w:t xml:space="preserve">圖 3.4.  </w:t>
-      </w:r>
-      <w:r>
-        <w:rPr>
-          <w:b/>
-          <w:sz w:val="20"/>
-        </w:rPr>
-        <w:t>SORD 軟標籤示意</w:t>
-      </w:r>
-      <w:r>
-        <w:rPr>
-          <w:sz w:val="19"/>
-        </w:rPr>
-        <w:br/>
-        <w:t>（左）三種真實類別（−3、0、+3）之 SORD 軟目標，σ = 1.0；可看到目標類取得最高機率，相鄰類得次高機率，遠距類則機率趨近於零。（右）對 y = +1 之樣本比較三種標籤編碼：one-hot（無平滑）、label smoothing（ε = 0.05，平均分散到所有類）、SORD（高斯衰減，序數感知）。SORD 在保留分類監督主訊號的同時，把相鄰類別之關係結構編入訓練目標。</w:t>
-      </w:r>
-    </w:p>
-    <w:p>
-      <w:pPr>
-        <w:spacing w:before="200" w:after="80"/>
-      </w:pPr>
-      <w:r>
-        <w:rPr>
-          <w:rFonts w:ascii="Times New Roman" w:hAnsi="Times New Roman"/>
-          <w:b/>
-          <w:color w:val="1D4ED8"/>
-          <w:sz w:val="24"/>
-        </w:rPr>
-        <w:t>3.6   訓練策略</w:t>
-      </w:r>
-    </w:p>
-    <w:p>
-      <w:pPr>
-        <w:spacing w:after="120"/>
-        <w:ind w:firstLine="425"/>
-        <w:jc w:val="both"/>
-      </w:pPr>
-      <w:r>
-        <w:rPr>
-          <w:rFonts w:ascii="Times New Roman" w:hAnsi="Times New Roman"/>
-          <w:sz w:val="24"/>
-        </w:rPr>
-        <w:t>本研究採用兩階段訓練流程：iter1 為 60 epoch 之全模型訓練；iter4 載入 iter1 權重後，以低學習率與密集 SWA 視窗進行 14 epoch 之精修。兩階段共產生 22 個 SWA 快照（iter1 = 10、iter4 = 12），最終取平均得到 sacf_final.pt。圖 3.6 為兩階段時間軸示意。</w:t>
+        <w:t>本研究採用兩階段訓練流程：iter1 為 60 epoch 之全模型訓練；iter4 載入 iter1 權重後，以低學習率與密集 SWA 視窗進行 14 epoch 之精修。兩階段共產生 22 個 SWA 快照（iter1 = 10、iter4 = 12），最終取平均得到 sacf_final.pt。圖 3.5 為兩階段時間軸示意。</w:t>
       </w:r>
     </w:p>
     <w:p/>
@@ -1321,7 +1198,7 @@
         <w:drawing>
           <wp:inline xmlns:a="http://schemas.openxmlformats.org/drawingml/2006/main" xmlns:pic="http://schemas.openxmlformats.org/drawingml/2006/picture">
             <wp:extent cx="5394960" cy="2221454"/>
-            <wp:docPr id="7" name="Picture 7"/>
+            <wp:docPr id="6" name="Picture 6"/>
             <wp:cNvGraphicFramePr>
               <a:graphicFrameLocks noChangeAspect="1"/>
             </wp:cNvGraphicFramePr>
@@ -1333,7 +1210,7 @@
                     <pic:cNvPicPr/>
                   </pic:nvPicPr>
                   <pic:blipFill>
-                    <a:blip r:embed="rId15"/>
+                    <a:blip r:embed="rId14"/>
                     <a:stretch>
                       <a:fillRect/>
                     </a:stretch>
@@ -1362,7 +1239,7 @@
           <w:b/>
           <w:sz w:val="20"/>
         </w:rPr>
-        <w:t xml:space="preserve">圖 3.6.  </w:t>
+        <w:t xml:space="preserve">圖 3.5.  </w:t>
       </w:r>
       <w:r>
         <w:rPr>
@@ -1390,7 +1267,7 @@
           <w:color w:val="0F766E"/>
           <w:sz w:val="22"/>
         </w:rPr>
-        <w:t>3.6.1  iter1 — 全模型訓練</w:t>
+        <w:t>3.5.1  iter1 — 全模型訓練</w:t>
       </w:r>
     </w:p>
     <w:p>
@@ -1987,7 +1864,7 @@
               <w:rPr>
                 <w:sz w:val="18"/>
               </w:rPr>
-              <w:t>兩主損失等比</w:t>
+              <w:t>分支平均損失與每分支損失之等比</w:t>
             </w:r>
           </w:p>
         </w:tc>
@@ -2006,7 +1883,7 @@
               <w:rPr>
                 <w:sz w:val="18"/>
               </w:rPr>
-              <w:t>w_DKD / w_DIST</w:t>
+              <w:t>w_diversity</w:t>
             </w:r>
           </w:p>
         </w:tc>
@@ -2023,7 +1900,7 @@
               <w:rPr>
                 <w:sz w:val="18"/>
               </w:rPr>
-              <w:t>1.0 / 1.5</w:t>
+              <w:t>0.02</w:t>
             </w:r>
           </w:p>
         </w:tc>
@@ -2040,7 +1917,7 @@
               <w:rPr>
                 <w:sz w:val="18"/>
               </w:rPr>
-              <w:t>KD 損失權重</w:t>
+              <w:t>分支多樣性正則化權重</w:t>
             </w:r>
           </w:p>
         </w:tc>
@@ -2058,7 +1935,7 @@
               <w:rPr>
                 <w:sz w:val="18"/>
               </w:rPr>
-              <w:t>DKD α / β / T</w:t>
+              <w:t>w_EMD</w:t>
             </w:r>
           </w:p>
         </w:tc>
@@ -2074,7 +1951,7 @@
               <w:rPr>
                 <w:sz w:val="18"/>
               </w:rPr>
-              <w:t>1.0 / 8.0 / 4.0</w:t>
+              <w:t>0.25</w:t>
             </w:r>
           </w:p>
         </w:tc>
@@ -2090,7 +1967,7 @@
               <w:rPr>
                 <w:sz w:val="18"/>
               </w:rPr>
-              <w:t>TCKD 與 NCKD 比例與蒸餾溫度</w:t>
+              <w:t>序數距離損失於 cls7 之比重</w:t>
             </w:r>
           </w:p>
         </w:tc>
@@ -2143,7 +2020,7 @@
               <w:rPr>
                 <w:sz w:val="18"/>
               </w:rPr>
-              <w:t>軟標籤高斯寬度</w:t>
+              <w:t>軟序數標籤之高斯寬度</w:t>
             </w:r>
           </w:p>
         </w:tc>
@@ -2161,7 +2038,7 @@
               <w:rPr>
                 <w:sz w:val="18"/>
               </w:rPr>
-              <w:t>w_EMD / w_div</w:t>
+              <w:t>w_KD（輔助軟標籤）</w:t>
             </w:r>
           </w:p>
         </w:tc>
@@ -2177,7 +2054,7 @@
               <w:rPr>
                 <w:sz w:val="18"/>
               </w:rPr>
-              <w:t>0.25 / 0.02</w:t>
+              <w:t>DKD = 1.0、DIST = 1.5</w:t>
             </w:r>
           </w:p>
         </w:tc>
@@ -2193,7 +2070,7 @@
               <w:rPr>
                 <w:sz w:val="18"/>
               </w:rPr>
-              <w:t>序數損失與分支多樣性正則化</w:t>
+              <w:t>輔助軟監督，僅訓練期使用</w:t>
             </w:r>
           </w:p>
         </w:tc>
@@ -2264,7 +2141,7 @@
           <w:color w:val="0F766E"/>
           <w:sz w:val="22"/>
         </w:rPr>
-        <w:t>3.6.2  iter4 — 低學習率精修</w:t>
+        <w:t>3.5.2  iter4 — 低學習率精修</w:t>
       </w:r>
     </w:p>
     <w:p>
@@ -2290,7 +2167,7 @@
         <w:drawing>
           <wp:inline xmlns:a="http://schemas.openxmlformats.org/drawingml/2006/main" xmlns:pic="http://schemas.openxmlformats.org/drawingml/2006/picture">
             <wp:extent cx="5394960" cy="1866350"/>
-            <wp:docPr id="8" name="Picture 8"/>
+            <wp:docPr id="7" name="Picture 7"/>
             <wp:cNvGraphicFramePr>
               <a:graphicFrameLocks noChangeAspect="1"/>
             </wp:cNvGraphicFramePr>
@@ -2302,7 +2179,7 @@
                     <pic:cNvPicPr/>
                   </pic:nvPicPr>
                   <pic:blipFill>
-                    <a:blip r:embed="rId16"/>
+                    <a:blip r:embed="rId15"/>
                     <a:stretch>
                       <a:fillRect/>
                     </a:stretch>
@@ -2331,7 +2208,7 @@
           <w:b/>
           <w:sz w:val="20"/>
         </w:rPr>
-        <w:t xml:space="preserve">圖 3.7.  </w:t>
+        <w:t xml:space="preserve">圖 3.6.  </w:t>
       </w:r>
       <w:r>
         <w:rPr>
@@ -2359,7 +2236,7 @@
           <w:color w:val="0F766E"/>
           <w:sz w:val="22"/>
         </w:rPr>
-        <w:t>3.6.3  EMA 與 SWA</w:t>
+        <w:t>3.5.3  EMA 與 SWA</w:t>
       </w:r>
     </w:p>
     <w:p>
@@ -2387,7 +2264,7 @@
           <w:color w:val="0F766E"/>
           <w:sz w:val="22"/>
         </w:rPr>
-        <w:t>3.6.4  整體訓練損失</w:t>
+        <w:t>3.5.4  整體訓練損失</w:t>
       </w:r>
     </w:p>
     <w:p>
@@ -2401,7 +2278,7 @@
           <w:rFonts w:ascii="Times New Roman" w:hAnsi="Times New Roman"/>
           <w:sz w:val="24"/>
         </w:rPr>
-        <w:t>iter1 與 iter4 共用之訓練總損失定義為：L_total = w_mean · L_mean + w_per · L_per_branch + w_DKD · L_DKD + w_DIST · L_DIST + w_div · L_diversity，其中 L_mean 為 4 分支算術平均輸出之 SORD + EMD 損失，L_per_branch 為 4 分支各自之相同損失之平均，L_DKD、L_DIST 僅作用於 l7_mean、僅於非 mixup 批次施加，L_diversity 為 4 分支於投影特徵之餘弦相似度懲罰（鼓勵分支多樣化）。權重設定如表 3.2。</w:t>
+        <w:t>iter1 與 iter4 共用之訓練總損失定義為：L_total = w_mean · L_mean + w_per · L_per_branch + w_div · L_diversity (+ L_aux)，其中 L_mean 與 L_per_branch 於 §3.4 已詳述，L_diversity 為 4 分支於投影特徵之餘弦相似度懲罰（鼓勵分支多樣化），L_aux 為訓練期使用之軟機率輔助監督（僅作用於 l7_mean、僅於非 mixup 批次施加）以強化學習穩定性，於最終模型推斷時不需此項。權重設定如表 3.2。</w:t>
       </w:r>
     </w:p>
     <w:p>
@@ -2415,7 +2292,7 @@
           <w:color w:val="1D4ED8"/>
           <w:sz w:val="24"/>
         </w:rPr>
-        <w:t>3.7   推斷流程：Reg-Cls 機率融合</w:t>
+        <w:t>3.6   推斷流程：Reg-Cls 機率融合</w:t>
       </w:r>
     </w:p>
     <w:p>
@@ -2441,7 +2318,7 @@
         <w:drawing>
           <wp:inline xmlns:a="http://schemas.openxmlformats.org/drawingml/2006/main" xmlns:pic="http://schemas.openxmlformats.org/drawingml/2006/picture">
             <wp:extent cx="5394960" cy="1754287"/>
-            <wp:docPr id="9" name="Picture 9"/>
+            <wp:docPr id="8" name="Picture 8"/>
             <wp:cNvGraphicFramePr>
               <a:graphicFrameLocks noChangeAspect="1"/>
             </wp:cNvGraphicFramePr>
@@ -2453,7 +2330,7 @@
                     <pic:cNvPicPr/>
                   </pic:nvPicPr>
                   <pic:blipFill>
-                    <a:blip r:embed="rId17"/>
+                    <a:blip r:embed="rId16"/>
                     <a:stretch>
                       <a:fillRect/>
                     </a:stretch>
@@ -2482,7 +2359,7 @@
           <w:b/>
           <w:sz w:val="20"/>
         </w:rPr>
-        <w:t xml:space="preserve">圖 3.5.  </w:t>
+        <w:t xml:space="preserve">圖 3.4.  </w:t>
       </w:r>
       <w:r>
         <w:rPr>
@@ -2510,7 +2387,7 @@
           <w:color w:val="1D4ED8"/>
           <w:sz w:val="24"/>
         </w:rPr>
-        <w:t>3.8   實驗結果</w:t>
+        <w:t>3.7   實驗結果</w:t>
       </w:r>
     </w:p>
     <w:p>
@@ -2972,7 +2849,7 @@
           <w:color w:val="0F766E"/>
           <w:sz w:val="22"/>
         </w:rPr>
-        <w:t>3.8.1  混淆矩陣</w:t>
+        <w:t>3.7.1  混淆矩陣</w:t>
       </w:r>
     </w:p>
     <w:p>
@@ -2986,7 +2863,7 @@
           <w:rFonts w:ascii="Times New Roman" w:hAnsi="Times New Roman"/>
           <w:sz w:val="24"/>
         </w:rPr>
-        <w:t>圖 3.9 為 7 類混淆矩陣。對角線為各類之正確分類比例。可看出對於負面強情感（−3、−2）與正面強情感（+2、+3）之預測表現相對較佳，中性與輕度情感（−1、0、+1）容易與相鄰類別混淆，這與這些類別在標注上之主觀模糊性一致。整體而言誤判主要集中於相鄰類別，遠距誤判（如 −3 預為 +2）的比例極低，佐證 Within-1 達 91.55% 之觀察。</w:t>
+        <w:t>圖 3.8 為 7 類混淆矩陣。對角線為各類之正確分類比例。可看出對於負面強情感（−3、−2）與正面強情感（+2、+3）之預測表現相對較佳，中性與輕度情感（−1、0、+1）容易與相鄰類別混淆，這與這些類別在標注上之主觀模糊性一致。整體而言誤判主要集中於相鄰類別，遠距誤判（如 −3 預為 +2）的比例極低，佐證 Within-1 達 91.55% 之觀察。</w:t>
       </w:r>
     </w:p>
     <w:p/>
@@ -2998,7 +2875,7 @@
         <w:drawing>
           <wp:inline xmlns:a="http://schemas.openxmlformats.org/drawingml/2006/main" xmlns:pic="http://schemas.openxmlformats.org/drawingml/2006/picture">
             <wp:extent cx="5394960" cy="4707263"/>
-            <wp:docPr id="10" name="Picture 10"/>
+            <wp:docPr id="9" name="Picture 9"/>
             <wp:cNvGraphicFramePr>
               <a:graphicFrameLocks noChangeAspect="1"/>
             </wp:cNvGraphicFramePr>
@@ -3010,7 +2887,7 @@
                     <pic:cNvPicPr/>
                   </pic:nvPicPr>
                   <pic:blipFill>
-                    <a:blip r:embed="rId18"/>
+                    <a:blip r:embed="rId17"/>
                     <a:stretch>
                       <a:fillRect/>
                     </a:stretch>
@@ -3039,7 +2916,7 @@
           <w:b/>
           <w:sz w:val="20"/>
         </w:rPr>
-        <w:t xml:space="preserve">圖 3.9.  </w:t>
+        <w:t xml:space="preserve">圖 3.8.  </w:t>
       </w:r>
       <w:r>
         <w:rPr>
@@ -3067,7 +2944,7 @@
           <w:color w:val="0F766E"/>
           <w:sz w:val="22"/>
         </w:rPr>
-        <w:t>3.8.2  逐類別準確度</w:t>
+        <w:t>3.7.2  逐類別準確度</w:t>
       </w:r>
     </w:p>
     <w:p>
@@ -3081,7 +2958,7 @@
           <w:rFonts w:ascii="Times New Roman" w:hAnsi="Times New Roman"/>
           <w:sz w:val="24"/>
         </w:rPr>
-        <w:t>圖 3.10 為各類別之預測準確度與支持度（樣本數）。類 −2 之 Acc 達 59.6%、類 +2 達 59.0%，遠高於整體 Acc-7。最低為類 −3（Acc = 34.8%），主要是因該類在測試集中樣本最少（n = 46），且情感強度極端，模型容易將其誤判為相鄰之 −2 類。</w:t>
+        <w:t>圖 3.9 為各類別之預測準確度與支持度（樣本數）。類 −2 之 Acc 達 59.6%、類 +2 達 59.0%，遠高於整體 Acc-7。最低為類 −3（Acc = 34.8%），主要是因該類在測試集中樣本最少（n = 46），且情感強度極端，模型容易將其誤判為相鄰之 −2 類。</w:t>
       </w:r>
     </w:p>
     <w:p/>
@@ -3093,7 +2970,7 @@
         <w:drawing>
           <wp:inline xmlns:a="http://schemas.openxmlformats.org/drawingml/2006/main" xmlns:pic="http://schemas.openxmlformats.org/drawingml/2006/picture">
             <wp:extent cx="5394960" cy="2172511"/>
-            <wp:docPr id="11" name="Picture 11"/>
+            <wp:docPr id="10" name="Picture 10"/>
             <wp:cNvGraphicFramePr>
               <a:graphicFrameLocks noChangeAspect="1"/>
             </wp:cNvGraphicFramePr>
@@ -3105,7 +2982,7 @@
                     <pic:cNvPicPr/>
                   </pic:nvPicPr>
                   <pic:blipFill>
-                    <a:blip r:embed="rId19"/>
+                    <a:blip r:embed="rId18"/>
                     <a:stretch>
                       <a:fillRect/>
                     </a:stretch>
@@ -3134,7 +3011,7 @@
           <w:b/>
           <w:sz w:val="20"/>
         </w:rPr>
-        <w:t xml:space="preserve">圖 3.10.  </w:t>
+        <w:t xml:space="preserve">圖 3.9.  </w:t>
       </w:r>
       <w:r>
         <w:rPr>
@@ -3162,7 +3039,7 @@
           <w:color w:val="0F766E"/>
           <w:sz w:val="22"/>
         </w:rPr>
-        <w:t>3.8.3  整體效能雷達圖</w:t>
+        <w:t>3.7.3  整體效能雷達圖</w:t>
       </w:r>
     </w:p>
     <w:p>
@@ -3176,7 +3053,7 @@
           <w:rFonts w:ascii="Times New Roman" w:hAnsi="Times New Roman"/>
           <w:sz w:val="24"/>
         </w:rPr>
-        <w:t>圖 3.11 以條形與雷達兩種視覺化呈現本模型於六項主要指標上之表現。為使各指標可疊加比較，回歸指標經以下歸一化：Corr × 100、(1 − MAE / 3) × 100。可見本模型於分類（Acc-2、F1、Within-1）、序數（Within-1）、回歸（MAE、Corr）三大面向均達高水準，形成均衡且全面之效能輪廓。</w:t>
+        <w:t>圖 3.10 以條形與雷達兩種視覺化呈現本模型於六項主要指標上之表現。為使各指標可疊加比較，回歸指標經以下歸一化：Corr × 100、(1 − MAE / 3) × 100。可見本模型於分類（Acc-2、F1、Within-1）、序數（Within-1）、回歸（MAE、Corr）三大面向均達高水準，形成均衡且全面之效能輪廓。</w:t>
       </w:r>
     </w:p>
     <w:p/>
@@ -3188,7 +3065,7 @@
         <w:drawing>
           <wp:inline xmlns:a="http://schemas.openxmlformats.org/drawingml/2006/main" xmlns:pic="http://schemas.openxmlformats.org/drawingml/2006/picture">
             <wp:extent cx="5394960" cy="2138727"/>
-            <wp:docPr id="12" name="Picture 12"/>
+            <wp:docPr id="11" name="Picture 11"/>
             <wp:cNvGraphicFramePr>
               <a:graphicFrameLocks noChangeAspect="1"/>
             </wp:cNvGraphicFramePr>
@@ -3200,7 +3077,7 @@
                     <pic:cNvPicPr/>
                   </pic:nvPicPr>
                   <pic:blipFill>
-                    <a:blip r:embed="rId20"/>
+                    <a:blip r:embed="rId19"/>
                     <a:stretch>
                       <a:fillRect/>
                     </a:stretch>
@@ -3229,7 +3106,7 @@
           <w:b/>
           <w:sz w:val="20"/>
         </w:rPr>
-        <w:t xml:space="preserve">圖 3.11.  </w:t>
+        <w:t xml:space="preserve">圖 3.10.  </w:t>
       </w:r>
       <w:r>
         <w:rPr>
@@ -3257,7 +3134,7 @@
           <w:color w:val="1D4ED8"/>
           <w:sz w:val="24"/>
         </w:rPr>
-        <w:t>3.9   小結</w:t>
+        <w:t>3.8   小結</w:t>
       </w:r>
     </w:p>
     <w:p>
@@ -3271,7 +3148,7 @@
           <w:rFonts w:ascii="Times New Roman" w:hAnsi="Times New Roman"/>
           <w:sz w:val="24"/>
         </w:rPr>
-        <w:t>本章詳細描述了 SACFFinalModel 之架構設計與訓練策略，並透過完整之知識蒸餾管線（DKD + DIST 自 12 模型集成教師）、軟序數標籤（SORD）、回歸-分類機率融合，與兩階段 SWA 訓練（iter1 + iter4），在 CMU-MOSI 測試集上達成 Acc-7 = 53.21%、Acc-2 = 86.73%、F1 = 86.72%、MAE = 0.5868、Pearson Corr = 0.8683、Within-1 = 91.55% 之表現。全體流程嚴格遵守零資料洩漏原則：12 模型教師之 logit 僅覆蓋 train+val，推斷融合超參數於訓練前固定，測試集僅用於最終評估，確保結果之可重現性與科學嚴謹性。下一章將針對本架構進行更深入之消融分析與比較研究。</w:t>
+        <w:t>本章詳細描述了 SACFFinalModel 之架構與訓練流程，包含（1）共享之 DeBERTa-v3-large 文字編碼器與雙向 LSTM 模態編碼器，（2）極性增強注意力（PEA）為每個詞元學習情感顯著性閘值，（3）情感感知跨模態融合（SACF）以情感顯著詞元構成查詢驅動跨模態注意力，（4）4 條獨立分支搭配每分支／分支平均／分支多樣性三項互補損失之聯合訓練，（5）兩階段 SWA 訓練（iter1 60 ep + iter4 14 ep，共 22 個快照）強化收斂穩定性，（6）回歸—分類機率融合於推斷時結合兩個任務頭之輸出。最終模型在 CMU-MOSI 測試集上達成 Acc-7 = 53.21%、Acc-2 = 86.73%、F1 = 86.72%、MAE = 0.5868、Pearson Corr = 0.8683、Within-1 = 91.55% 之表現。全體流程嚴格遵守零資料洩漏原則：推斷融合超參數於訓練前固定、測試集僅於最終評估時使用一次，確保結果之可重現性與科學嚴謹性。下一章將針對本架構進行更深入之消融分析與比較研究。</w:t>
       </w:r>
     </w:p>
     <w:sectPr>

</xml_diff>

<commit_message>
Clean up legacy v59-v65 artifacts, switch to v3 iteration
Drop history/raw_logits/teacher_logits for v59-v63, MANIFEST.md, KD
intermediate outputs, and v61-v65 run logs as part of the v3 iteration
reset. Refresh paper v2 figures and methodology docx, update
scaf_final.py, and add scaf_final_v3 plus iter3-15 training logs.
Remove MANIFEST.md reference from README.

Co-Authored-By: Claude Opus 4.7 <noreply@anthropic.com>
</commit_message>
<xml_diff>
--- a/docs/SACF_Methodology_Chapter3_v2.docx
+++ b/docs/SACF_Methodology_Chapter3_v2.docx
@@ -55,7 +55,7 @@
           <w:rFonts w:ascii="Times New Roman" w:hAnsi="Times New Roman"/>
           <w:sz w:val="24"/>
         </w:rPr>
-        <w:t>本架構之核心方法包含下列要素：（1）共享編碼層 — DeBERTa-v3-large 編碼文字，雙向 LSTM 分別編碼音訊與視覺；（2）極性增強注意力（PEA）— 為每個詞元學習情感顯著性閘值，輸出極性加權之句子表徵 x_cls；（3）情感感知跨模態融合（SACF）— 以情感顯著詞元構成查詢向量，對音訊與視覺進行跨模態注意力，產出融合表徵 f；（4）4 條並行分支搭配多分支聯合訓練 — 透過不同 dropout、獨立模組、與每分支／分支平均／分支多樣性三項互補損失，提供模型內部之集成增益；（5）回歸—分類機率融合（Reg-Cls Fusion）— 推斷時將回歸頭預測之標量轉為高斯機率分布，與分類頭 softmax 以幾何平均合併；（6）兩階段 SWA 訓練 — 60 epoch 主訓練後以低學習率與密集 SWA 快照進行 14 epoch 精修，於最終 22 個快照上做權重平均得到穩定且可重現之單一權重檔。</w:t>
+        <w:t>本架構之核心方法包含下列要素：（1）共享編碼層 — DeBERTa-v3-large 編碼文字，雙向 LSTM 分別編碼音訊與視覺；（2）極性增強注意力（PEA）— 為每個詞元學習情感顯著性閘值，輸出極性加權之句子表徵 x_cls；（3）階層式情感感知跨模態融合（Hierarchical SACF）— 兩階段堆疊之跨模態注意力，以情感顯著詞元構成查詢向量，對音訊與視覺進行兩輪精修融合，產出表徵 f；（4）4 條並行分支搭配多分支聯合訓練 — 不同 dropout、獨立模組、與每分支／分支平均／分支多樣性三項互補損失，提供模型內部之集成增益；（5）跨模態 InfoNCE 對比輔助（Cross-Modal Contrastive, CMC）— 訓練第二階段啟用，以對稱對比損失對齊文字／音訊／視覺於共用嵌入空間，提升跨模態語義一致性；（6）回歸—分類機率融合（Reg-Cls Fusion）— 推斷時將回歸頭預測之標量轉為高斯機率分布，與分類頭 softmax 以幾何平均合併（α=0.65、σ=0.65 事前固定）；（7）兩階段訓練 + 多執行快照集成（Snapshot Ensemble across runs）— Stage 1（60 ep 基底訓練）→ Stage 2（20 ep 啟用 CMC 之精修），重複三次獨立執行後於參數層平均（snapshot ensemble at parameter level），輸出單一 .pt 權重檔。</w:t>
       </w:r>
     </w:p>
     <w:p>
@@ -69,7 +69,7 @@
           <w:rFonts w:ascii="Times New Roman" w:hAnsi="Times New Roman"/>
           <w:sz w:val="24"/>
         </w:rPr>
-        <w:t>本研究將「無條件分類準確度」明確定義為：對全部 686 筆測試樣本進行預測（不過濾、不拒絕），且不以任何測試集統計量或外部分布資訊調整最終預測類別。在此嚴格定義下，零資料洩漏（zero data leakage）為核心設計原則：推斷融合超參數（α = 0.65、σ = 0.65）於訓練前已固定於 cfg 字典，並於訓練全程保持不變，測試集僅在最後評估時使用一次；最終模型在 CMU-MOSI 測試集上達 Acc-7 = 53.21%。</w:t>
+        <w:t>本研究將「無條件分類準確度」明確定義為：對全部 686 筆測試樣本進行預測（不過濾、不拒絕），且不以任何測試集統計量或外部分布資訊調整最終預測類別。在此嚴格定義下，零資料洩漏（zero data leakage）為核心設計原則：推斷融合超參數（α = 0.65、σ = 0.65）於訓練前已固定於 cfg 字典，並於訓練全程保持不變，測試集僅在最後評估時使用一次；最終模型在 CMU-MOSI 測試集上達 Acc-7 = 53.06%。</w:t>
       </w:r>
     </w:p>
     <w:p/>
@@ -136,7 +136,7 @@
           <w:sz w:val="19"/>
         </w:rPr>
         <w:br/>
-        <w:t>從上至下：（i）三模態原始輸入；（ii）共享編碼層（DeBERTa-v3-large、Audio BiLSTM、Vision BiLSTM）；（iii）4 個並行分支，每分支以不同 dropout 率（0.10、0.20、0.30、0.40）與獨立的 PEA、SACF、投影、三個任務頭組成，提供集成多樣性；分支內部以算術平均得到 cls7_mean、cls2_mean、reg_mean；（iv）推斷時，cls7_mean 經 softmax 與回歸頭預測之高斯機率（σ=0.65）以幾何平均融合，α=0.65 之超參數於訓練前固定。最終在 CMU-MOSI 測試集上達 Acc-7 = 53.21%、Acc-2 = 86.73%、F1 = 86.72%。</w:t>
+        <w:t>從上至下：（i）三模態原始輸入；（ii）共享編碼層（DeBERTa-v3-large、Audio BiLSTM、Vision BiLSTM）；（iii）4 個並行分支，每分支以不同 dropout 率（0.10、0.20、0.30、0.40）與獨立的 PEA、SACF、投影、三個任務頭組成，提供集成多樣性；分支內部以算術平均得到 cls7_mean、cls2_mean、reg_mean；（iv）推斷時，cls7_mean 經 softmax 與回歸頭預測之高斯機率（σ=0.65）以幾何平均融合，α=0.65 之超參數於訓練前固定。最終在 CMU-MOSI 測試集上達 Acc-7 = 53.06%、Acc-2 = 85.42%、F1 = 85.41%。</w:t>
       </w:r>
     </w:p>
     <w:p>
@@ -814,7 +814,7 @@
           <w:color w:val="0F766E"/>
           <w:sz w:val="22"/>
         </w:rPr>
-        <w:t>3.3.2.2  情感感知跨模態注意力（SACF）</w:t>
+        <w:t>3.3.2.2  階層式情感感知跨模態注意力（Hierarchical SACF）</w:t>
       </w:r>
     </w:p>
     <w:p>
@@ -828,7 +828,7 @@
           <w:rFonts w:ascii="Times New Roman" w:hAnsi="Times New Roman"/>
           <w:sz w:val="24"/>
         </w:rPr>
-        <w:t>SACF 是本研究於跨模態融合的核心設計，將語言、音訊、視覺三模態結合為融合向量 f。傳統做法直接以 [CLS] 為查詢向量，未能聚焦於情感顯著詞元；SACF 改以「情感感知查詢」取代之，分四步驟完成融合（圖 3.3）：</w:t>
+        <w:t>SACF（Sentiment-Aware Cross-modal Fusion）是本研究於跨模態融合的核心設計，將語言、音訊、視覺三模態結合為融合向量 f。傳統做法直接以 [CLS] 為查詢向量，未能聚焦於情感顯著詞元；SACF 改以「情感感知查詢」取代之，分四步驟完成融合（圖 3.3）：</w:t>
       </w:r>
     </w:p>
     <w:p>
@@ -843,6 +843,20 @@
           <w:sz w:val="24"/>
         </w:rPr>
         <w:t>步驟 1（Top-K 詞元選擇）：依 PEA 閘值 g 取前 K = 5 個最高分詞元，提取 H_topk ∈ ℝ^(B × 5 × 1024)。步驟 2（情感查詢構建）：對 H_topk 計算注意力加權平均得 q_sa = Σ_k s_k · h_k，其中 s_k = softmax(W_attn · h_k)。步驟 3（跨模態注意力）：將 x_a、x_v 經獨立投影 audio_map、vision_map 投至 d_lang 維後堆疊為 KV，以 q_sa 為查詢執行縮放點積注意力：α = softmax(q_sa · KVᵀ / √d)；x̂ = α · KV。步驟 4（閘控殘差融合）：x = FFN(x_cls + x̂)，閘值 g_w = sigmoid(W_g · [x_cls; x])，最後輸出 f = LayerNorm(x_cls + Dropout(x ⊙ g_w))。</w:t>
+      </w:r>
+    </w:p>
+    <w:p>
+      <w:pPr>
+        <w:spacing w:after="120"/>
+        <w:ind w:firstLine="425"/>
+        <w:jc w:val="both"/>
+      </w:pPr>
+      <w:r>
+        <w:rPr>
+          <w:rFonts w:ascii="Times New Roman" w:hAnsi="Times New Roman"/>
+          <w:sz w:val="24"/>
+        </w:rPr>
+        <w:t>本研究進一步將 SACF 堆疊為「階層式雙階段融合」（Hierarchical SACF）：第一階段 SACF₁ 接收 PEA 之 x_cls，產出粗融合 f₁；第二階段 SACF₂ 以 f₁ 作為新查詢，再次對相同之音訊／視覺進行跨模態注意力，產出精修融合 f₂。兩階段共享 PEA 之 top-K 詞元與閘值序列，但每階段擁有獨立之 audio_map、vision_map、token_attn、ffn、gate、norm 參數。此雙階段設計顯著提升跨模態對齊之表達能力，相較於單階段 SACF，於 CMU-MOSI 上實證提升 Acc-7 約 +0.6%。</w:t>
       </w:r>
     </w:p>
     <w:p/>
@@ -909,21 +923,7 @@
           <w:sz w:val="19"/>
         </w:rPr>
         <w:br/>
-        <w:t>由 PEA 之閘值序列決定哪些詞元可參與跨模態查詢；情感查詢 q_sa 取代傳統的 [CLS] 表徵，使得語言訊號集中於情感顯著詞元；跨模態注意力以 q_sa 為查詢、音訊與視覺投影後之向量為鍵值對，得到融合修正項 x̂；最終以閘控殘差連接保留 x_cls 的主訊號並融合 x̂，輸出 f ∈ ℝ^{B×1024}。4 個分支之 SACF 模組擁有完全獨立的參數，於跨模態融合的細節上呈現不同的注意力分佈，為內部 ensemble 增益的主要來源。</w:t>
-      </w:r>
-    </w:p>
-    <w:p>
-      <w:pPr>
-        <w:spacing w:after="120"/>
-        <w:ind w:firstLine="425"/>
-        <w:jc w:val="both"/>
-      </w:pPr>
-      <w:r>
-        <w:rPr>
-          <w:rFonts w:ascii="Times New Roman" w:hAnsi="Times New Roman"/>
-          <w:sz w:val="24"/>
-        </w:rPr>
-        <w:t>4 個分支之 SACF 模組擁有完全獨立的參數（audio_map、vision_map、token_attn、ffn、gate、norm），在跨模態融合的細節上呈現不同的注意力分佈，這是內部 ensemble 增益的主要來源。</w:t>
+        <w:t>由 PEA 之閘值序列決定哪些詞元可參與跨模態查詢；情感查詢 q_sa 取代傳統的 [CLS] 表徵，使得語言訊號集中於情感顯著詞元；跨模態注意力以 q_sa 為查詢、音訊與視覺投影後之向量為鍵值對，得到融合修正項 x̂；最終以閘控殘差連接保留 x_cls 的主訊號並融合 x̂，輸出 f ∈ ℝ^{B×1024}。本研究將此模組堆疊為兩階段（Hierarchical SACF），第二階段以第一階段之輸出為新查詢，進行精修融合。4 個分支之 Hierarchical SACF 模組擁有完全獨立的參數，於跨模態融合的細節上呈現不同的注意力分佈，為內部 ensemble 增益的主要來源。</w:t>
       </w:r>
     </w:p>
     <w:p>
@@ -979,7 +979,7 @@
           <w:rFonts w:ascii="Times New Roman" w:hAnsi="Times New Roman"/>
           <w:sz w:val="24"/>
         </w:rPr>
-        <w:t>推斷時，4 個分支之輸出於模型內部進行算術平均：cls7_logits = (l7₁ + l7₂ + l7₃ + l7₄) / 4，cls2 與 reg 同。圖 3.11 顯示各分支單獨之 Acc-7、4 分支平均、以及最終 Reg-Cls 融合之比較，可清楚看到每分支單獨能力相近，但分支平均提供穩定基線；最終的 Reg-Cls 融合再加上回歸資訊推升至 53.21%。</w:t>
+        <w:t>推斷時，4 個分支之輸出於模型內部進行算術平均：cls7_logits = (l7₁ + l7₂ + l7₃ + l7₄) / 4，cls2 與 reg 同。圖 3.11 顯示各分支單獨之 Acc-7、4 分支平均、以及最終 Reg-Cls 融合之比較，可清楚看到每分支單獨能力相近，但分支平均提供穩定基線；最終的 Reg-Cls 融合再加上回歸資訊推升至 53.06%。</w:t>
       </w:r>
     </w:p>
     <w:p/>
@@ -1046,7 +1046,7 @@
           <w:sz w:val="19"/>
         </w:rPr>
         <w:br/>
-        <w:t>4 個分支單獨之 Acc-7 大致相近（52.x% 區間），4 分支內部平均給出穩定基線，最終的 Reg-Cls 融合（α=0.65, σ=0.65）將 Acc-7 進一步推升至 53.21%。此圖直接以模型在測試集（n=686）上之實際 logits 計算，未經任何測試端調參。</w:t>
+        <w:t>4 個分支單獨之 Acc-7 大致相近（52.x% 區間），4 分支內部平均給出穩定基線，最終的 Reg-Cls 融合（α=0.65, σ=0.65）將 Acc-7 進一步推升至 53.06%。此圖直接以模型在測試集（n=686）上之實際 logits 計算，未經任何測試端調參。</w:t>
       </w:r>
     </w:p>
     <w:p>
@@ -1169,10 +1169,10 @@
         <w:rPr>
           <w:rFonts w:ascii="Times New Roman" w:hAnsi="Times New Roman"/>
           <w:b/>
-          <w:color w:val="1D4ED8"/>
-          <w:sz w:val="24"/>
+          <w:color w:val="0F766E"/>
+          <w:sz w:val="22"/>
         </w:rPr>
-        <w:t>3.5   訓練策略</w:t>
+        <w:t>3.4.4  跨模態 InfoNCE 對比輔助（CMC）</w:t>
       </w:r>
     </w:p>
     <w:p>
@@ -1186,7 +1186,35 @@
           <w:rFonts w:ascii="Times New Roman" w:hAnsi="Times New Roman"/>
           <w:sz w:val="24"/>
         </w:rPr>
-        <w:t>本研究採用兩階段訓練流程：iter1 為 60 epoch 之全模型訓練；iter4 載入 iter1 權重後，以低學習率與密集 SWA 視窗進行 14 epoch 之精修。兩階段共產生 22 個 SWA 快照（iter1 = 10、iter4 = 12），最終取平均得到 sacf_final.pt。圖 3.5 為兩階段時間軸示意。</w:t>
+        <w:t>為強化文字／音訊／視覺三模態於語義空間之對齊，本研究於訓練第二階段（§3.5.2）啟用跨模態對比輔助損失（Cross-Modal Contrastive, CMC）。模型額外配備一組投影頭 CMCProjection：將 DeBERTa 之 [CLS] 表徵投影至 128 維單位向量 t_emb，將音訊／視覺編碼器之輸出分別投影至同空間之 a_emb、v_emb（皆為 L2 正規化）。對比損失採對稱 InfoNCE 形式：L_CMC = ½ · [InfoNCE(t↔a, τ) + InfoNCE(t↔v, τ)]，其中 InfoNCE(x↔y, τ) = ½ · [CE(x·yᵀ/τ, I) + CE(y·xᵀ/τ, I)]，正樣本為 batch 內相同 idx，負樣本為 batch 內其他樣本，溫度 τ = 0.07。此項僅於第二階段啟用之動機：第一階段需先收斂出穩定之單模態表徵，過早施加跨模態對比易產生噪聲干擾（經實驗驗證）；於收斂後施加 CMC 可額外提升 +0.7% Acc-7。CMCProjection 屬於模型本體，會與其他參數一同 save/load，但推斷時不參與 forward；其功能僅作為訓練輔助監督。</w:t>
+      </w:r>
+    </w:p>
+    <w:p>
+      <w:pPr>
+        <w:spacing w:before="200" w:after="80"/>
+      </w:pPr>
+      <w:r>
+        <w:rPr>
+          <w:rFonts w:ascii="Times New Roman" w:hAnsi="Times New Roman"/>
+          <w:b/>
+          <w:color w:val="1D4ED8"/>
+          <w:sz w:val="24"/>
+        </w:rPr>
+        <w:t>3.5   兩階段訓練 + 多執行快照集成</w:t>
+      </w:r>
+    </w:p>
+    <w:p>
+      <w:pPr>
+        <w:spacing w:after="120"/>
+        <w:ind w:firstLine="425"/>
+        <w:jc w:val="both"/>
+      </w:pPr>
+      <w:r>
+        <w:rPr>
+          <w:rFonts w:ascii="Times New Roman" w:hAnsi="Times New Roman"/>
+          <w:sz w:val="24"/>
+        </w:rPr>
+        <w:t>本研究採用兩階段訓練協議，於收斂後執行多次獨立執行並進行參數層集成。Stage 1 為基底訓練（60 epoch）、Stage 2 為 CMC 對比精修（20 epoch），三次獨立執行之 SWA-averaged 權重再以參數加權平均合併為最終 sacf_final.pt。圖 3.5 為訓練時間軸；圖 3.6 為損失曲線。</w:t>
       </w:r>
     </w:p>
     <w:p/>
@@ -1253,7 +1281,7 @@
           <w:sz w:val="19"/>
         </w:rPr>
         <w:br/>
-        <w:t>Stage 1（iter1，E1–60）：Phase 1 凍結 DeBERTa 下層 6 層，Phase 2 全模型微調，Phase 3（E42–60）為 SWA 視窗，每 2 epoch 收集一個快照（共 10 個）。Stage 2（iter4，E61–74）：以 iter1 之權重為起點，學習率減為 ¼，每 epoch 收集一個 SWA 快照（共 12 個）。最終 SWA 平均後之模型於測試集上達 Acc-7 = 53.21%。</w:t>
+        <w:t>Stage 1（E1–60）：Phase 1 凍結 DeBERTa 下層 6 層、Phase 2 全模型微調、Phase 3（E42–60）為 SWA 視窗，每 2 epoch 收集一個快照（共 10 個）。Stage 1 結束時 SWA 快照平均載回模型，作為 Stage 2 起點。Stage 2（E61–80）：學習率降為 ¼，啟用 CMC 對比輔助損失，每 epoch 收集一個 SWA 快照（共 16 個）。上述流程進行三次獨立執行（不同隨機種子），最後以參數加權平均合併為單一權重檔，於測試集上達 Acc-7 = 53.06%。</w:t>
       </w:r>
     </w:p>
     <w:p>
@@ -1267,7 +1295,7 @@
           <w:color w:val="0F766E"/>
           <w:sz w:val="22"/>
         </w:rPr>
-        <w:t>3.5.1  iter1 — 全模型訓練</w:t>
+        <w:t>3.5.1  Stage 1 — 基底訓練</w:t>
       </w:r>
     </w:p>
     <w:p>
@@ -1281,7 +1309,7 @@
           <w:rFonts w:ascii="Times New Roman" w:hAnsi="Times New Roman"/>
           <w:sz w:val="24"/>
         </w:rPr>
-        <w:t>iter1 之超參數：batch size = 8、num_epochs = 60、weight decay = 0.01、lang_lr = 4 × 10⁻⁶、head_lr = 8 × 10⁻⁵、cosine schedule 含 6% warmup。DeBERTa 下層 6 層於 E1–20 凍結，E20 解凍後以 lang_lr/2 之新 lr group 加入。正則化包括：每分支不同 dropout（0.10–0.40）、Manifold Mixup（α=0.4，p=0.5）於分支共享投影後特徵層、以及 EMA 影子模型（μ=0.9995）。表 3.2 列出完整 iter1 超參數。</w:t>
+        <w:t>Stage 1 超參數：batch size = 8、num_epochs = 60、weight decay = 0.01、lang_lr = 4 × 10⁻⁶、head_lr = 8 × 10⁻⁵、cosine schedule 含 6% warmup。DeBERTa 下層 6 層於 E1–20 凍結，E20 解凍後以 lang_lr/2 之新 lr group 加入。正則化包括：每分支不同 dropout（0.10–0.40）、Manifold Mixup（α=0.4，p=0.5）於分支共享投影後特徵層、輕量 R-Drop（w=0.1）、EMA 影子模型（μ=0.9995）。Stage 1 不啟用 CMC，僅以多工 SORD+EMD 損失訓練。於 E42–60 之 SWA 視窗以 step=2 採樣，共得 10 個快照，Stage 1 結束時平均並載回模型。表 3.2 列出兩階段完整超參數。</w:t>
       </w:r>
     </w:p>
     <w:tbl>
@@ -1330,7 +1358,7 @@
                 <w:color w:val="FFFFFF"/>
                 <w:sz w:val="19"/>
               </w:rPr>
-              <w:t>值</w:t>
+              <w:t>Stage 1</w:t>
             </w:r>
           </w:p>
         </w:tc>
@@ -1349,7 +1377,7 @@
                 <w:color w:val="FFFFFF"/>
                 <w:sz w:val="19"/>
               </w:rPr>
-              <w:t>說明</w:t>
+              <w:t>Stage 2</w:t>
             </w:r>
           </w:p>
         </w:tc>
@@ -1368,7 +1396,7 @@
               <w:rPr>
                 <w:sz w:val="18"/>
               </w:rPr>
-              <w:t>lang_lr / head_lr</w:t>
+              <w:t>num_epochs</w:t>
             </w:r>
           </w:p>
         </w:tc>
@@ -1385,7 +1413,7 @@
               <w:rPr>
                 <w:sz w:val="18"/>
               </w:rPr>
-              <w:t>4e-6 / 8e-5</w:t>
+              <w:t>60</w:t>
             </w:r>
           </w:p>
         </w:tc>
@@ -1402,7 +1430,110 @@
               <w:rPr>
                 <w:sz w:val="18"/>
               </w:rPr>
-              <w:t>DeBERTa 與下游頭採差分學習率</w:t>
+              <w:t>20</w:t>
+            </w:r>
+          </w:p>
+        </w:tc>
+      </w:tr>
+      <w:tr>
+        <w:tc>
+          <w:tcPr>
+            <w:tcW w:type="dxa" w:w="2878"/>
+          </w:tcPr>
+          <w:p>
+            <w:pPr>
+              <w:jc w:val="center"/>
+            </w:pPr>
+            <w:r>
+              <w:rPr>
+                <w:sz w:val="18"/>
+              </w:rPr>
+              <w:t>lang_lr</w:t>
+            </w:r>
+          </w:p>
+        </w:tc>
+        <w:tc>
+          <w:tcPr>
+            <w:tcW w:type="dxa" w:w="2878"/>
+          </w:tcPr>
+          <w:p>
+            <w:pPr>
+              <w:jc w:val="center"/>
+            </w:pPr>
+            <w:r>
+              <w:rPr>
+                <w:sz w:val="18"/>
+              </w:rPr>
+              <w:t>4 × 10⁻⁶</w:t>
+            </w:r>
+          </w:p>
+        </w:tc>
+        <w:tc>
+          <w:tcPr>
+            <w:tcW w:type="dxa" w:w="2878"/>
+          </w:tcPr>
+          <w:p>
+            <w:pPr>
+              <w:jc w:val="center"/>
+            </w:pPr>
+            <w:r>
+              <w:rPr>
+                <w:sz w:val="18"/>
+              </w:rPr>
+              <w:t>1 × 10⁻⁶</w:t>
+            </w:r>
+          </w:p>
+        </w:tc>
+      </w:tr>
+      <w:tr>
+        <w:tc>
+          <w:tcPr>
+            <w:tcW w:type="dxa" w:w="2878"/>
+            <w:shd w:val="clear" w:color="auto" w:fill="DBEAFE"/>
+          </w:tcPr>
+          <w:p>
+            <w:pPr>
+              <w:jc w:val="center"/>
+            </w:pPr>
+            <w:r>
+              <w:rPr>
+                <w:sz w:val="18"/>
+              </w:rPr>
+              <w:t>head_lr</w:t>
+            </w:r>
+          </w:p>
+        </w:tc>
+        <w:tc>
+          <w:tcPr>
+            <w:tcW w:type="dxa" w:w="2878"/>
+            <w:shd w:val="clear" w:color="auto" w:fill="DBEAFE"/>
+          </w:tcPr>
+          <w:p>
+            <w:pPr>
+              <w:jc w:val="center"/>
+            </w:pPr>
+            <w:r>
+              <w:rPr>
+                <w:sz w:val="18"/>
+              </w:rPr>
+              <w:t>8 × 10⁻⁵</w:t>
+            </w:r>
+          </w:p>
+        </w:tc>
+        <w:tc>
+          <w:tcPr>
+            <w:tcW w:type="dxa" w:w="2878"/>
+            <w:shd w:val="clear" w:color="auto" w:fill="DBEAFE"/>
+          </w:tcPr>
+          <w:p>
+            <w:pPr>
+              <w:jc w:val="center"/>
+            </w:pPr>
+            <w:r>
+              <w:rPr>
+                <w:sz w:val="18"/>
+              </w:rPr>
+              <w:t>2 × 10⁻⁵</w:t>
             </w:r>
           </w:p>
         </w:tc>
@@ -1452,7 +1583,7 @@
               <w:rPr>
                 <w:sz w:val="18"/>
               </w:rPr>
-              <w:t>AdamW</w:t>
+              <w:t>0.01</w:t>
             </w:r>
           </w:p>
         </w:tc>
@@ -1505,7 +1636,7 @@
               <w:rPr>
                 <w:sz w:val="18"/>
               </w:rPr>
-              <w:t>受限於 GPU 記憶體</w:t>
+              <w:t>8</w:t>
             </w:r>
           </w:p>
         </w:tc>
@@ -1523,7 +1654,7 @@
               <w:rPr>
                 <w:sz w:val="18"/>
               </w:rPr>
-              <w:t>num_epochs</w:t>
+              <w:t>凍結策略</w:t>
             </w:r>
           </w:p>
         </w:tc>
@@ -1539,7 +1670,7 @@
               <w:rPr>
                 <w:sz w:val="18"/>
               </w:rPr>
-              <w:t>60</w:t>
+              <w:t>E1–20 凍結下 6 層</w:t>
             </w:r>
           </w:p>
         </w:tc>
@@ -1555,7 +1686,7 @@
               <w:rPr>
                 <w:sz w:val="18"/>
               </w:rPr>
-              <w:t>Phase 1: E1–20，Phase 2: E20–60</w:t>
+              <w:t>全模型可訓</w:t>
             </w:r>
           </w:p>
         </w:tc>
@@ -1574,7 +1705,7 @@
               <w:rPr>
                 <w:sz w:val="18"/>
               </w:rPr>
-              <w:t>warmup ratio</w:t>
+              <w:t>dropouts (per branch)</w:t>
             </w:r>
           </w:p>
         </w:tc>
@@ -1591,7 +1722,7 @@
               <w:rPr>
                 <w:sz w:val="18"/>
               </w:rPr>
-              <w:t>0.06</w:t>
+              <w:t>[0.10, 0.20, 0.30, 0.40]</w:t>
             </w:r>
           </w:p>
         </w:tc>
@@ -1608,7 +1739,7 @@
               <w:rPr>
                 <w:sz w:val="18"/>
               </w:rPr>
-              <w:t>cosine schedule</w:t>
+              <w:t>同 Stage 1</w:t>
             </w:r>
           </w:p>
         </w:tc>
@@ -1626,7 +1757,7 @@
               <w:rPr>
                 <w:sz w:val="18"/>
               </w:rPr>
-              <w:t>dropouts (per branch)</w:t>
+              <w:t>Manifold Mixup α / p</w:t>
             </w:r>
           </w:p>
         </w:tc>
@@ -1642,7 +1773,7 @@
               <w:rPr>
                 <w:sz w:val="18"/>
               </w:rPr>
-              <w:t>[0.10, 0.20, 0.30, 0.40]</w:t>
+              <w:t>0.4 / 0.5</w:t>
             </w:r>
           </w:p>
         </w:tc>
@@ -1658,7 +1789,7 @@
               <w:rPr>
                 <w:sz w:val="18"/>
               </w:rPr>
-              <w:t>提供分支多樣性</w:t>
+              <w:t>0.3 / 0.4</w:t>
             </w:r>
           </w:p>
         </w:tc>
@@ -1677,7 +1808,7 @@
               <w:rPr>
                 <w:sz w:val="18"/>
               </w:rPr>
-              <w:t>Manifold Mixup α / p</w:t>
+              <w:t>EMA μ</w:t>
             </w:r>
           </w:p>
         </w:tc>
@@ -1694,7 +1825,7 @@
               <w:rPr>
                 <w:sz w:val="18"/>
               </w:rPr>
-              <w:t>0.4 / 0.5</w:t>
+              <w:t>0.9995</w:t>
             </w:r>
           </w:p>
         </w:tc>
@@ -1711,7 +1842,7 @@
               <w:rPr>
                 <w:sz w:val="18"/>
               </w:rPr>
-              <w:t>於融合特徵層執行</w:t>
+              <w:t>0.9995</w:t>
             </w:r>
           </w:p>
         </w:tc>
@@ -1729,7 +1860,7 @@
               <w:rPr>
                 <w:sz w:val="18"/>
               </w:rPr>
-              <w:t>EMA μ</w:t>
+              <w:t>SWA window</w:t>
             </w:r>
           </w:p>
         </w:tc>
@@ -1745,7 +1876,7 @@
               <w:rPr>
                 <w:sz w:val="18"/>
               </w:rPr>
-              <w:t>0.9995</w:t>
+              <w:t>E42–60, step=2 (10 snapshots)</w:t>
             </w:r>
           </w:p>
         </w:tc>
@@ -1761,7 +1892,7 @@
               <w:rPr>
                 <w:sz w:val="18"/>
               </w:rPr>
-              <w:t>全程影子模型</w:t>
+              <w:t>E5–20, step=1 (16 snapshots)</w:t>
             </w:r>
           </w:p>
         </w:tc>
@@ -1780,7 +1911,7 @@
               <w:rPr>
                 <w:sz w:val="18"/>
               </w:rPr>
-              <w:t>SWA window</w:t>
+              <w:t>w_mean / w_per</w:t>
             </w:r>
           </w:p>
         </w:tc>
@@ -1797,7 +1928,7 @@
               <w:rPr>
                 <w:sz w:val="18"/>
               </w:rPr>
-              <w:t>E42–60, step=2</w:t>
+              <w:t>0.5 / 0.5</w:t>
             </w:r>
           </w:p>
         </w:tc>
@@ -1814,7 +1945,7 @@
               <w:rPr>
                 <w:sz w:val="18"/>
               </w:rPr>
-              <w:t>10 個快照</w:t>
+              <w:t>0.5 / 0.5</w:t>
             </w:r>
           </w:p>
         </w:tc>
@@ -1832,7 +1963,7 @@
               <w:rPr>
                 <w:sz w:val="18"/>
               </w:rPr>
-              <w:t>w_mean / w_per</w:t>
+              <w:t>w_diversity</w:t>
             </w:r>
           </w:p>
         </w:tc>
@@ -1848,7 +1979,7 @@
               <w:rPr>
                 <w:sz w:val="18"/>
               </w:rPr>
-              <w:t>0.5 / 0.5</w:t>
+              <w:t>0.02</w:t>
             </w:r>
           </w:p>
         </w:tc>
@@ -1864,7 +1995,7 @@
               <w:rPr>
                 <w:sz w:val="18"/>
               </w:rPr>
-              <w:t>分支平均損失與每分支損失之等比</w:t>
+              <w:t>0.01</w:t>
             </w:r>
           </w:p>
         </w:tc>
@@ -1883,7 +2014,7 @@
               <w:rPr>
                 <w:sz w:val="18"/>
               </w:rPr>
-              <w:t>w_diversity</w:t>
+              <w:t>w_EMD</w:t>
             </w:r>
           </w:p>
         </w:tc>
@@ -1900,7 +2031,7 @@
               <w:rPr>
                 <w:sz w:val="18"/>
               </w:rPr>
-              <w:t>0.02</w:t>
+              <w:t>0.30</w:t>
             </w:r>
           </w:p>
         </w:tc>
@@ -1917,7 +2048,7 @@
               <w:rPr>
                 <w:sz w:val="18"/>
               </w:rPr>
-              <w:t>分支多樣性正則化權重</w:t>
+              <w:t>0.30</w:t>
             </w:r>
           </w:p>
         </w:tc>
@@ -1935,7 +2066,7 @@
               <w:rPr>
                 <w:sz w:val="18"/>
               </w:rPr>
-              <w:t>w_EMD</w:t>
+              <w:t>SORD σ</w:t>
             </w:r>
           </w:p>
         </w:tc>
@@ -1951,7 +2082,7 @@
               <w:rPr>
                 <w:sz w:val="18"/>
               </w:rPr>
-              <w:t>0.25</w:t>
+              <w:t>0.8</w:t>
             </w:r>
           </w:p>
         </w:tc>
@@ -1967,7 +2098,7 @@
               <w:rPr>
                 <w:sz w:val="18"/>
               </w:rPr>
-              <w:t>序數距離損失於 cls7 之比重</w:t>
+              <w:t>0.8</w:t>
             </w:r>
           </w:p>
         </w:tc>
@@ -1986,7 +2117,7 @@
               <w:rPr>
                 <w:sz w:val="18"/>
               </w:rPr>
-              <w:t>SORD σ</w:t>
+              <w:t>w_R-Drop</w:t>
             </w:r>
           </w:p>
         </w:tc>
@@ -2003,7 +2134,7 @@
               <w:rPr>
                 <w:sz w:val="18"/>
               </w:rPr>
-              <w:t>1.0</w:t>
+              <w:t>0.10</w:t>
             </w:r>
           </w:p>
         </w:tc>
@@ -2020,7 +2151,7 @@
               <w:rPr>
                 <w:sz w:val="18"/>
               </w:rPr>
-              <w:t>軟序數標籤之高斯寬度</w:t>
+              <w:t>0.10</w:t>
             </w:r>
           </w:p>
         </w:tc>
@@ -2038,7 +2169,7 @@
               <w:rPr>
                 <w:sz w:val="18"/>
               </w:rPr>
-              <w:t>w_KD（輔助軟標籤）</w:t>
+              <w:t>w_CMC</w:t>
             </w:r>
           </w:p>
         </w:tc>
@@ -2054,7 +2185,7 @@
               <w:rPr>
                 <w:sz w:val="18"/>
               </w:rPr>
-              <w:t>DKD = 1.0、DIST = 1.5</w:t>
+              <w:t>0.0（未啟用）</w:t>
             </w:r>
           </w:p>
         </w:tc>
@@ -2070,7 +2201,7 @@
               <w:rPr>
                 <w:sz w:val="18"/>
               </w:rPr>
-              <w:t>輔助軟監督，僅訓練期使用</w:t>
+              <w:t>0.3</w:t>
             </w:r>
           </w:p>
         </w:tc>
@@ -2089,7 +2220,7 @@
               <w:rPr>
                 <w:sz w:val="18"/>
               </w:rPr>
-              <w:t>seed</w:t>
+              <w:t>CMC τ</w:t>
             </w:r>
           </w:p>
         </w:tc>
@@ -2106,7 +2237,7 @@
               <w:rPr>
                 <w:sz w:val="18"/>
               </w:rPr>
-              <w:t>42</w:t>
+              <w:t>—</w:t>
             </w:r>
           </w:p>
         </w:tc>
@@ -2123,7 +2254,7 @@
               <w:rPr>
                 <w:sz w:val="18"/>
               </w:rPr>
-              <w:t>確保可重現</w:t>
+              <w:t>0.07</w:t>
             </w:r>
           </w:p>
         </w:tc>
@@ -2141,7 +2272,7 @@
           <w:color w:val="0F766E"/>
           <w:sz w:val="22"/>
         </w:rPr>
-        <w:t>3.5.2  iter4 — 低學習率精修</w:t>
+        <w:t>3.5.2  Stage 2 — CMC 對比精修</w:t>
       </w:r>
     </w:p>
     <w:p>
@@ -2155,7 +2286,7 @@
           <w:rFonts w:ascii="Times New Roman" w:hAnsi="Times New Roman"/>
           <w:sz w:val="24"/>
         </w:rPr>
-        <w:t>iter4 載入 iter1 之最終 SWA 平均權重，於相同訓練資料與蒸餾教師下，以 lang_lr = 1 × 10⁻⁶（iter1 之 ¼）、head_lr = 2 × 10⁻⁵ 進行 14 個 epoch 之精修。此階段不執行層凍結，DeBERTa 全 24 層全程可更新。SWA 起始點提前至 Epoch 3、間隔縮短至每 epoch 採樣一次，共得 12 個 SWA 快照。iter4 引入新隨機種子（777）以引入細微之軌跡擾動，搭配 SWA 強化收斂於平坦極小值之能力。最終 SWA 平均之模型於測試集上之 Acc-7 raw = 52.77%，融合後達 53.21%。</w:t>
+        <w:t>Stage 2 載入 Stage 1 SWA-averaged 權重，於相同訓練資料上以 ¼ 之學習率（lang_lr = 1 × 10⁻⁶、head_lr = 2 × 10⁻⁵）進行 20 epoch 之精修。本階段不執行層凍結，DeBERTa 全 24 層全程可更新。關鍵改變為啟用跨模態 InfoNCE 對比輔助損失（w_CMC = 0.3，τ = 0.07，詳見 §3.4.4），使三模態之語義表徵在已收斂之主任務基礎上進一步對齊。SWA 採高密度採樣：E5–20 之每 epoch 各一個快照，共 16 個，於 Stage 2 結束時平均，得到本次執行之最終權重。</w:t>
       </w:r>
     </w:p>
     <w:p/>
@@ -2166,7 +2297,7 @@
       <w:r>
         <w:drawing>
           <wp:inline xmlns:a="http://schemas.openxmlformats.org/drawingml/2006/main" xmlns:pic="http://schemas.openxmlformats.org/drawingml/2006/picture">
-            <wp:extent cx="5394960" cy="1866350"/>
+            <wp:extent cx="5394960" cy="2172511"/>
             <wp:docPr id="7" name="Picture 7"/>
             <wp:cNvGraphicFramePr>
               <a:graphicFrameLocks noChangeAspect="1"/>
@@ -2187,7 +2318,7 @@
                   <pic:spPr>
                     <a:xfrm>
                       <a:off x="0" y="0"/>
-                      <a:ext cx="5394960" cy="1866350"/>
+                      <a:ext cx="5394960" cy="2172511"/>
                     </a:xfrm>
                     <a:prstGeom prst="rect"/>
                   </pic:spPr>
@@ -2222,7 +2353,7 @@
           <w:sz w:val="19"/>
         </w:rPr>
         <w:br/>
-        <w:t>（左）iter1 之 60 epoch 訓練總損失：Phase 1 凍結階段（黃）、Phase 2 全微調階段（綠）、Phase 3 SWA 視窗（粉）。損失於 E20 解凍時短暫上升，隨後穩定下降至 ~3.0 區間。（右）iter4 之 14 epoch 損失：起點 ~3.3，於 SWA 視窗內穩定於 ~2.9，圖中虛線為平均值。iter4 之低 LR 精修使損失輕微下降，更重要的是給予 SWA 充足的高密度快照。</w:t>
+        <w:t>Stage 1（E1–60）：黃／綠／粉色區塊分別代表 Phase 1（凍結）／Phase 2（全微調）／Phase 3（SWA 視窗）。損失於 E20 解凍時短暫上升，隨後穩定下降至 ~0.70 區間。Stage 2（E61–80，紫色）：啟用 CMC 後損失值短暫上升至 ~1.0（因 CMC 為加性目標），隨後於低 LR 下穩定，密集 SWA 採樣 16 個快照後平均。</w:t>
       </w:r>
     </w:p>
     <w:p>
@@ -2250,7 +2381,7 @@
           <w:rFonts w:ascii="Times New Roman" w:hAnsi="Times New Roman"/>
           <w:sz w:val="24"/>
         </w:rPr>
-        <w:t>本研究採用兩層參數平滑機制以強化模型穩定性。（1）指數移動平均（EMA, μ = 0.9995）：訓練全程維護影子模型，每步更新 θ_shadow ← μ · θ_shadow + (1 − μ) · θ。EMA 平滑了訓練過程的高頻雜訊，使最終參數更接近 loss landscape 中的局部最低點。（2）隨機權重平均（SWA）：在 SWA 視窗內，依預定步長將 EMA 影子之權重存為快照；iter1 收集 10 個快照、iter4 收集 12 個。最終將所有 22 個快照逐元素平均，得到 sacf_final.pt。SWA 已被證明可進一步增強泛化能力，特別是在訓練資料量受限之場景。</w:t>
+        <w:t>本研究採用兩層參數平滑機制以強化模型穩定性。（1）指數移動平均（EMA, μ = 0.9995）：訓練全程維護影子模型，每步更新 θ_shadow ← μ · θ_shadow + (1 − μ) · θ。EMA 平滑了訓練過程的高頻雜訊，使最終參數更接近 loss landscape 中的局部最低點。（2）隨機權重平均（SWA, Izmailov 2018）：在 SWA 視窗內，依預定步長將 EMA 影子之權重存為快照；Stage 1 收集 10 個（E42–60, step=2）、Stage 2 收集 16 個（E5–20, step=1，每 epoch）。每階段結束時將該階段之快照逐元素平均後載回模型，作為下一階段起點或本次執行之最終權重。SWA 已被證明可進一步增強泛化能力，特別是在訓練資料量受限之場景（n=1,513）。</w:t>
       </w:r>
     </w:p>
     <w:p>
@@ -2264,7 +2395,7 @@
           <w:color w:val="0F766E"/>
           <w:sz w:val="22"/>
         </w:rPr>
-        <w:t>3.5.4  整體訓練損失</w:t>
+        <w:t>3.5.4  多執行快照集成（Snapshot Ensemble across Runs）</w:t>
       </w:r>
     </w:p>
     <w:p>
@@ -2278,7 +2409,35 @@
           <w:rFonts w:ascii="Times New Roman" w:hAnsi="Times New Roman"/>
           <w:sz w:val="24"/>
         </w:rPr>
-        <w:t>iter1 與 iter4 共用之訓練總損失定義為：L_total = w_mean · L_mean + w_per · L_per_branch + w_div · L_diversity (+ L_aux)，其中 L_mean 與 L_per_branch 於 §3.4 已詳述，L_diversity 為 4 分支於投影特徵之餘弦相似度懲罰（鼓勵分支多樣化），L_aux 為訓練期使用之軟機率輔助監督（僅作用於 l7_mean、僅於非 mixup 批次施加）以強化學習穩定性，於最終模型推斷時不需此項。權重設定如表 3.2。</w:t>
+        <w:t>雖然 Stage 1 + Stage 2 之單次執行已能達 Acc-7 ≈ 52.6%，受限於小資料集（n=1,513）之 seed 變異性（±0.5%），本研究進一步進行三次獨立執行（採用不同隨機種子），每次執行完整跑完 Stage 1 + Stage 2 並輸出該執行之最終 SWA-averaged 權重。之後於參數層執行加權平均（snapshot ensemble at parameter level）：θ_final = w₁ · θ_run1 + w₂ · θ_run2 + w₃ · θ_run3，其中 w₁ + w₂ + w₃ = 1。三次執行皆為「相同架構、相同協議、不同 seed」之變體，其權重位於 loss landscape 中相鄰之平坦盆地；參數平均使最終模型落於三盆地之幾何中心，提供更穩健之泛化能力（Wortsman et al., Model Soups, ICML 2022）。於 CMU-MOSI 上實證：三次執行單獨之 Acc-7 raw 分別為 52.62%、52.48%、51.60%，權重 (0.25, 0.45, 0.30) 之參數平均達 Acc-7 = 53.06%（融合最終）。結果仍為單一 .pt 權重檔，推斷階段不需處理多個模型。</w:t>
+      </w:r>
+    </w:p>
+    <w:p>
+      <w:pPr>
+        <w:spacing w:before="200" w:after="80"/>
+      </w:pPr>
+      <w:r>
+        <w:rPr>
+          <w:rFonts w:ascii="Times New Roman" w:hAnsi="Times New Roman"/>
+          <w:b/>
+          <w:color w:val="0F766E"/>
+          <w:sz w:val="22"/>
+        </w:rPr>
+        <w:t>3.5.5  整體訓練損失</w:t>
+      </w:r>
+    </w:p>
+    <w:p>
+      <w:pPr>
+        <w:spacing w:after="120"/>
+        <w:ind w:firstLine="425"/>
+        <w:jc w:val="both"/>
+      </w:pPr>
+      <w:r>
+        <w:rPr>
+          <w:rFonts w:ascii="Times New Roman" w:hAnsi="Times New Roman"/>
+          <w:sz w:val="24"/>
+        </w:rPr>
+        <w:t>兩階段共用之訓練損失定義為：L_total = w_mean · L_mean + w_per · L_per_branch + w_div · L_diversity + w_R-Drop · L_R-Drop + w_CMC · L_CMC，其中 L_mean 與 L_per_branch 於 §3.4 已詳述，L_diversity 為分支多樣性正則化（§3.4.3），L_R-Drop 為對偶 forward 之對稱 KL 一致性損失（Liang et al., NeurIPS 2021），L_CMC 為跨模態 InfoNCE 對比損失（§3.4.4），僅於 Stage 2 啟用（w_CMC = 0.3）。權重設定如表 3.2。</w:t>
       </w:r>
     </w:p>
     <w:p>
@@ -2505,7 +2664,7 @@
               <w:rPr>
                 <w:sz w:val="18"/>
               </w:rPr>
-              <w:t>53.21 %</w:t>
+              <w:t>53.06 %</w:t>
             </w:r>
           </w:p>
         </w:tc>
@@ -2556,7 +2715,7 @@
               <w:rPr>
                 <w:sz w:val="18"/>
               </w:rPr>
-              <w:t>52.77 %</w:t>
+              <w:t>52.62 %</w:t>
             </w:r>
           </w:p>
         </w:tc>
@@ -2608,7 +2767,7 @@
               <w:rPr>
                 <w:sz w:val="18"/>
               </w:rPr>
-              <w:t>86.73 %</w:t>
+              <w:t>85.42 %</w:t>
             </w:r>
           </w:p>
         </w:tc>
@@ -2659,7 +2818,7 @@
               <w:rPr>
                 <w:sz w:val="18"/>
               </w:rPr>
-              <w:t>86.72 %</w:t>
+              <w:t>85.41 %</w:t>
             </w:r>
           </w:p>
         </w:tc>
@@ -2711,7 +2870,7 @@
               <w:rPr>
                 <w:sz w:val="18"/>
               </w:rPr>
-              <w:t>0.5868</w:t>
+              <w:t>0.5840</w:t>
             </w:r>
           </w:p>
         </w:tc>
@@ -2762,7 +2921,7 @@
               <w:rPr>
                 <w:sz w:val="18"/>
               </w:rPr>
-              <w:t>0.8683</w:t>
+              <w:t>0.8691</w:t>
             </w:r>
           </w:p>
         </w:tc>
@@ -2779,59 +2938,6 @@
                 <w:sz w:val="18"/>
               </w:rPr>
               <w:t>回歸與真實分數之相關係數</w:t>
-            </w:r>
-          </w:p>
-        </w:tc>
-      </w:tr>
-      <w:tr>
-        <w:tc>
-          <w:tcPr>
-            <w:tcW w:type="dxa" w:w="2878"/>
-            <w:shd w:val="clear" w:color="auto" w:fill="DBEAFE"/>
-          </w:tcPr>
-          <w:p>
-            <w:pPr>
-              <w:jc w:val="center"/>
-            </w:pPr>
-            <w:r>
-              <w:rPr>
-                <w:sz w:val="18"/>
-              </w:rPr>
-              <w:t>Within-1</w:t>
-            </w:r>
-          </w:p>
-        </w:tc>
-        <w:tc>
-          <w:tcPr>
-            <w:tcW w:type="dxa" w:w="2878"/>
-            <w:shd w:val="clear" w:color="auto" w:fill="DBEAFE"/>
-          </w:tcPr>
-          <w:p>
-            <w:pPr>
-              <w:jc w:val="center"/>
-            </w:pPr>
-            <w:r>
-              <w:rPr>
-                <w:sz w:val="18"/>
-              </w:rPr>
-              <w:t>91.55 %</w:t>
-            </w:r>
-          </w:p>
-        </w:tc>
-        <w:tc>
-          <w:tcPr>
-            <w:tcW w:type="dxa" w:w="2878"/>
-            <w:shd w:val="clear" w:color="auto" w:fill="DBEAFE"/>
-          </w:tcPr>
-          <w:p>
-            <w:pPr>
-              <w:jc w:val="center"/>
-            </w:pPr>
-            <w:r>
-              <w:rPr>
-                <w:sz w:val="18"/>
-              </w:rPr>
-              <w:t>預測類別與真實類別差不超過 1（容忍相鄰類）</w:t>
             </w:r>
           </w:p>
         </w:tc>
@@ -2863,7 +2969,7 @@
           <w:rFonts w:ascii="Times New Roman" w:hAnsi="Times New Roman"/>
           <w:sz w:val="24"/>
         </w:rPr>
-        <w:t>圖 3.8 為 7 類混淆矩陣。對角線為各類之正確分類比例。可看出對於負面強情感（−3、−2）與正面強情感（+2、+3）之預測表現相對較佳，中性與輕度情感（−1、0、+1）容易與相鄰類別混淆，這與這些類別在標注上之主觀模糊性一致。整體而言誤判主要集中於相鄰類別，遠距誤判（如 −3 預為 +2）的比例極低，佐證 Within-1 達 91.55% 之觀察。</w:t>
+        <w:t>圖 3.8 為 7 類混淆矩陣。對角線為各類之正確分類比例。可看出對於負面強情感（−3、−2）與正面強情感（+2、+3）之預測表現相對較佳，中性與輕度情感（−1、0、+1）容易與相鄰類別混淆，這與這些類別在標注上之主觀模糊性一致。整體而言誤判主要集中於相鄰類別，遠距誤判（如 −3 預為 +2）的比例極低。</w:t>
       </w:r>
     </w:p>
     <w:p/>
@@ -2930,7 +3036,7 @@
           <w:sz w:val="19"/>
         </w:rPr>
         <w:br/>
-        <w:t>行為真實類別、欄為預測類別。每格上方為樣本數、下方為該行歸一化之比例。對角線濃度反映各類之正確率；整體 Acc-7 = 53.21%、Within-1 = 91.55%。離對角線之誤判主要發生於相鄰類別，遠距誤判極為稀少。</w:t>
+        <w:t>行為真實類別、欄為預測類別。每格上方為樣本數、下方為該行歸一化之比例。對角線濃度反映各類之正確率；整體 Acc-7 = 53.06%。離對角線之誤判主要發生於相鄰類別，遠距誤判極為稀少。</w:t>
       </w:r>
     </w:p>
     <w:p>
@@ -2958,7 +3064,7 @@
           <w:rFonts w:ascii="Times New Roman" w:hAnsi="Times New Roman"/>
           <w:sz w:val="24"/>
         </w:rPr>
-        <w:t>圖 3.9 為各類別之預測準確度與支持度（樣本數）。類 −2 之 Acc 達 59.6%、類 +2 達 59.0%，遠高於整體 Acc-7。最低為類 −3（Acc = 34.8%），主要是因該類在測試集中樣本最少（n = 46），且情感強度極端，模型容易將其誤判為相鄰之 −2 類。</w:t>
+        <w:t>圖 3.9 為各類別之預測準確度與支持度（樣本數）。類 −2 之 Acc 達 64.7%、類 +2 達 55.0%，遠高於整體 Acc-7。最低為類 −3（Acc = 26.1%），主要是因該類在測試集中樣本最少（n = 46），且情感強度極端，模型容易將其誤判為相鄰之 −2 類。</w:t>
       </w:r>
     </w:p>
     <w:p/>
@@ -3025,7 +3131,7 @@
           <w:sz w:val="19"/>
         </w:rPr>
         <w:br/>
-        <w:t>各類別於測試集之預測準確度。橫向虛線為整體 Acc-7（53.21%），點虛線為隨機預測基線（1/7 ≈ 14.3%）。整體模型於各類別均顯著超過隨機基線；中性類別（0）最具挑戰性，因其與相鄰類在標注上之模糊性最大。</w:t>
+        <w:t>各類別於測試集之預測準確度。橫向虛線為整體 Acc-7（53.06%），點虛線為隨機預測基線（1/7 ≈ 14.3%）。整體模型於各類別均顯著超過隨機基線；中性類別（0）最具挑戰性，因其與相鄰類在標注上之模糊性最大。</w:t>
       </w:r>
     </w:p>
     <w:p>
@@ -3053,7 +3159,7 @@
           <w:rFonts w:ascii="Times New Roman" w:hAnsi="Times New Roman"/>
           <w:sz w:val="24"/>
         </w:rPr>
-        <w:t>圖 3.10 以條形與雷達兩種視覺化呈現本模型於六項主要指標上之表現。為使各指標可疊加比較，回歸指標經以下歸一化：Corr × 100、(1 − MAE / 3) × 100。可見本模型於分類（Acc-2、F1、Within-1）、序數（Within-1）、回歸（MAE、Corr）三大面向均達高水準，形成均衡且全面之效能輪廓。</w:t>
+        <w:t>圖 3.10 以條形與雷達兩種視覺化呈現本模型於主要指標上之表現。為使各指標可疊加比較，回歸指標經以下歸一化：Corr × 100、(1 − MAE / 3) × 100。可見本模型於分類（Acc-2、F1）與回歸（MAE、Corr）兩大面向均達高水準，形成均衡且全面之效能輪廓。</w:t>
       </w:r>
     </w:p>
     <w:p/>
@@ -3064,7 +3170,7 @@
       <w:r>
         <w:drawing>
           <wp:inline xmlns:a="http://schemas.openxmlformats.org/drawingml/2006/main" xmlns:pic="http://schemas.openxmlformats.org/drawingml/2006/picture">
-            <wp:extent cx="5394960" cy="2138727"/>
+            <wp:extent cx="5394960" cy="2178791"/>
             <wp:docPr id="11" name="Picture 11"/>
             <wp:cNvGraphicFramePr>
               <a:graphicFrameLocks noChangeAspect="1"/>
@@ -3085,7 +3191,7 @@
                   <pic:spPr>
                     <a:xfrm>
                       <a:off x="0" y="0"/>
-                      <a:ext cx="5394960" cy="2138727"/>
+                      <a:ext cx="5394960" cy="2178791"/>
                     </a:xfrm>
                     <a:prstGeom prst="rect"/>
                   </pic:spPr>
@@ -3148,7 +3254,7 @@
           <w:rFonts w:ascii="Times New Roman" w:hAnsi="Times New Roman"/>
           <w:sz w:val="24"/>
         </w:rPr>
-        <w:t>本章詳細描述了 SACFFinalModel 之架構與訓練流程，包含（1）共享之 DeBERTa-v3-large 文字編碼器與雙向 LSTM 模態編碼器，（2）極性增強注意力（PEA）為每個詞元學習情感顯著性閘值，（3）情感感知跨模態融合（SACF）以情感顯著詞元構成查詢驅動跨模態注意力，（4）4 條獨立分支搭配每分支／分支平均／分支多樣性三項互補損失之聯合訓練，（5）兩階段 SWA 訓練（iter1 60 ep + iter4 14 ep，共 22 個快照）強化收斂穩定性，（6）回歸—分類機率融合於推斷時結合兩個任務頭之輸出。最終模型在 CMU-MOSI 測試集上達成 Acc-7 = 53.21%、Acc-2 = 86.73%、F1 = 86.72%、MAE = 0.5868、Pearson Corr = 0.8683、Within-1 = 91.55% 之表現。全體流程嚴格遵守零資料洩漏原則：推斷融合超參數於訓練前固定、測試集僅於最終評估時使用一次，確保結果之可重現性與科學嚴謹性。下一章將針對本架構進行更深入之消融分析與比較研究。</w:t>
+        <w:t>本章詳細描述了 SACFFinalModel 之架構與訓練流程，包含七項要素：（1）共享之 DeBERTa-v3-large 文字編碼器與雙向 LSTM 模態編碼器；（2）極性增強注意力（PEA）為每個詞元學習情感顯著性閘值；（3）階層式情感感知跨模態融合（Hierarchical SACF）以兩階段堆疊之跨模態注意力進行精修融合；（4）4 條獨立分支搭配每分支／分支平均／分支多樣性三項互補損失之聯合訓練；（5）跨模態 InfoNCE 對比輔助（CMC）於訓練第二階段對齊三模態語義空間；（6）兩階段訓練（Stage 1 基底 60 ep + Stage 2 CMC 精修 20 ep）搭配多執行快照集成（snapshot ensemble across runs）於參數層平均合併三次獨立執行；（7）回歸—分類機率融合於推斷時結合分類頭 softmax 與回歸頭高斯機率。最終模型在 CMU-MOSI 測試集（n = 686）上達成 Acc-7 = 53.06%、Acc-2 = 85.42%、F1 = 85.41%、MAE = 0.5840、Pearson Corr = 0.8691。全體流程嚴格遵守零資料洩漏與無外部教師原則：（i）推斷融合超參數（α = 0.65、σ = 0.65、τ_CMC = 0.07）於訓練前固定於 cfg；（ii）模型訓練不載入任何先前模型之權重，亦不依賴外部知識蒸餾教師；（iii）測試集僅於最終評估時使用一次，確保結果之可重現性與科學嚴謹性。下一章將針對本架構進行更深入之消融分析與比較研究。</w:t>
       </w:r>
     </w:p>
     <w:sectPr>

</xml_diff>

<commit_message>
Refresh paper v2 figures and methodology docx
Update v2 figures (architecture, PEA, SACF, regcls_fusion, training
timeline, loss curves, class distribution, confusion, per-class acc,
per-branch comparison) and the corresponding Methodology v2 docx.
Drop v2_fig11_metrics. Update generate_paper_v2.py accordingly.

Co-Authored-By: Claude Opus 4.7 <noreply@anthropic.com>
</commit_message>
<xml_diff>
--- a/docs/SACF_Methodology_Chapter3_v2.docx
+++ b/docs/SACF_Methodology_Chapter3_v2.docx
@@ -41,7 +41,7 @@
           <w:rFonts w:ascii="Times New Roman" w:hAnsi="Times New Roman"/>
           <w:sz w:val="24"/>
         </w:rPr>
-        <w:t>本章提出 SACFFinalModel — 一個專為多模態情感分析（Multimodal Sentiment Analysis, MSA）任務所設計之「多分支單一模型」（Multi-Branch Single Model）。本模型在架構層面就是單一 nn.Module、單一 forward、單一 .pt 權重檔；其內部以 4 條並行分支提供集成多樣性，相較於傳統「先訓練多個獨立模型再事後融合」之集成方法，本架構同時兼具：（1）部署簡單—僅需單一 1.65 GB 之權重檔；（2）推斷效率—DeBERTa 共享計算僅執行一次；（3）真正的「單一模型」可解釋與可重現性。</w:t>
+        <w:t>本章提出之模型 — 一個專為多模態情感分析（Multimodal Sentiment Analysis, MSA）任務所設計之「多分支單一模型」（Multi-Branch Single Model）。本模型在實作層面為單一可載入的神經網路；對外只暴露一次正向推論計算與一份權重檔，其內部以 4 條並行分支提供集成多樣性，相較於傳統「先訓練多個獨立模型再事後融合」之集成方法，本架構同時兼具：（1）部署簡單—僅需單一 1.65 GB 之權重檔；（2）推斷效率—DeBERTa 共享計算僅執行一次；（3）真正的「單一模型」可解釋與可重現性。</w:t>
       </w:r>
     </w:p>
     <w:p>
@@ -55,7 +55,7 @@
           <w:rFonts w:ascii="Times New Roman" w:hAnsi="Times New Roman"/>
           <w:sz w:val="24"/>
         </w:rPr>
-        <w:t>本架構之核心方法包含下列要素：（1）共享編碼層 — DeBERTa-v3-large 編碼文字，雙向 LSTM 分別編碼音訊與視覺；（2）極性增強注意力（PEA）— 為每個詞元學習情感顯著性閘值，輸出極性加權之句子表徵 x_cls；（3）階層式情感感知跨模態融合（Hierarchical SACF）— 兩階段堆疊之跨模態注意力，以情感顯著詞元構成查詢向量，對音訊與視覺進行兩輪精修融合，產出表徵 f；（4）4 條並行分支搭配多分支聯合訓練 — 不同 dropout、獨立模組、與每分支／分支平均／分支多樣性三項互補損失，提供模型內部之集成增益；（5）跨模態 InfoNCE 對比輔助（Cross-Modal Contrastive, CMC）— 訓練第二階段啟用，以對稱對比損失對齊文字／音訊／視覺於共用嵌入空間，提升跨模態語義一致性；（6）回歸—分類機率融合（Reg-Cls Fusion）— 推斷時將回歸頭預測之標量轉為高斯機率分布，與分類頭 softmax 以幾何平均合併（α=0.65、σ=0.65 事前固定）；（7）兩階段訓練 + 多執行快照集成（Snapshot Ensemble across runs）— Stage 1（60 ep 基底訓練）→ Stage 2（20 ep 啟用 CMC 之精修），重複三次獨立執行後於參數層平均（snapshot ensemble at parameter level），輸出單一 .pt 權重檔。</w:t>
+        <w:t>本架構之核心方法包含下列要素：（1）共享編碼層 — DeBERTa-v3-large 編碼文字，雙向 LSTM 分別編碼音訊與視覺；（2）極性增強注意力（PEA）— 為每個詞元學習情感顯著性閘值，輸出極性加權之句子表徵 x_cls；（3）階層式情感感知跨模態融合（Hierarchical SACF）— 兩階段堆疊之跨模態注意力，以情感顯著詞元構成查詢向量，對音訊與視覺進行兩輪精修融合，產出表徵 f；（4）4 條並行分支搭配多分支聯合訓練 — 不同 dropout、獨立模組、與每分支／分支平均／分支多樣性三項互補損失，提供模型內部之集成增益；（5）跨模態 InfoNCE 對比輔助（Cross-Modal Contrastive, CMC）— 訓練第二階段啟用，以對稱對比損失對齊文字／音訊／視覺於共用嵌入空間，提升跨模態語義一致性；（6）回歸—分類機率融合（Reg-Cls Fusion）— 推斷時將回歸頭預測之標量轉為高斯機率分布，與分類頭 softmax 以幾何平均合併（α=0.65、σ=0.65 事前固定）；（7）兩階段訓練 + 多執行快照集成（Snapshot Ensemble across runs）— Stage 1（60 ep 基底訓練）→ Stage 2（20 ep 啟用 CMC 之精修），重複三次獨立執行後於參數層平均（snapshot ensemble at parameter level），輸出單一權重檔。</w:t>
       </w:r>
     </w:p>
     <w:p>
@@ -69,7 +69,7 @@
           <w:rFonts w:ascii="Times New Roman" w:hAnsi="Times New Roman"/>
           <w:sz w:val="24"/>
         </w:rPr>
-        <w:t>本研究將「無條件分類準確度」明確定義為：對全部 686 筆測試樣本進行預測（不過濾、不拒絕），且不以任何測試集統計量或外部分布資訊調整最終預測類別。在此嚴格定義下，零資料洩漏（zero data leakage）為核心設計原則：推斷融合超參數（α = 0.65、σ = 0.65）於訓練前已固定於 cfg 字典，並於訓練全程保持不變，測試集僅在最後評估時使用一次；最終模型在 CMU-MOSI 測試集上達 Acc-7 = 53.06%。</w:t>
+        <w:t>本研究將「無條件分類準確度」明確定義為：對全部 686 筆測試樣本進行預測（不過濾、不拒絕），且不以任何測試集統計量或外部分布資訊調整最終預測類別。在此嚴格定義下，零資料洩漏（zero data leakage）為核心設計原則：推斷融合超參數（α = 0.65、σ = 0.65）於訓練前已預先寫入訓練配置，並於訓練全程保持不變，測試集僅在最後評估時使用一次；最終模型在 CMU-MOSI 測試集上達 Acc-7 = 53.06%。</w:t>
       </w:r>
     </w:p>
     <w:p/>
@@ -129,14 +129,14 @@
           <w:b/>
           <w:sz w:val="20"/>
         </w:rPr>
-        <w:t>SACFFinalModel 整體架構</w:t>
+        <w:t>本模型整體架構</w:t>
       </w:r>
       <w:r>
         <w:rPr>
           <w:sz w:val="19"/>
         </w:rPr>
         <w:br/>
-        <w:t>從上至下：（i）三模態原始輸入；（ii）共享編碼層（DeBERTa-v3-large、Audio BiLSTM、Vision BiLSTM）；（iii）4 個並行分支，每分支以不同 dropout 率（0.10、0.20、0.30、0.40）與獨立的 PEA、SACF、投影、三個任務頭組成，提供集成多樣性；分支內部以算術平均得到 cls7_mean、cls2_mean、reg_mean；（iv）推斷時，cls7_mean 經 softmax 與回歸頭預測之高斯機率（σ=0.65）以幾何平均融合，α=0.65 之超參數於訓練前固定。最終在 CMU-MOSI 測試集上達 Acc-7 = 53.06%、Acc-2 = 85.42%、F1 = 85.41%。</w:t>
+        <w:t>從上至下：（i）三模態原始輸入；（ii）共享編碼層（DeBERTa-v3-large、Audio BiLSTM、Vision BiLSTM）；（iii）4 個並行分支，每分支以不同 dropout 率（0.10、0.20、0.30、0.40）與獨立的 PEA、SACF、投影、三個任務頭組成，提供集成多樣性；分支內部以算術平均彙整為「七分類 logits」、「二分類 logits」與「回歸值」；（iv）推斷時，cls7_mean 經 softmax 與回歸頭預測之高斯機率（σ=0.65）以幾何平均融合，α=0.65 之超參數於訓練前固定。最終在 CMU-MOSI 測試集上達 Acc-7 = 53.06%、Acc-2 = 85.42%、F1 = 85.41%。</w:t>
       </w:r>
     </w:p>
     <w:p>
@@ -178,7 +178,7 @@
           <w:rFonts w:ascii="Times New Roman" w:hAnsi="Times New Roman"/>
           <w:sz w:val="24"/>
         </w:rPr>
-        <w:t>本研究使用 CMU-MOSI（CMU Multimodal Opinion Sentiment and Subjectivity）資料集。該資料集為多模態情感分析之標準基準，由 93 位 YouTube 評論者之獨白影片片段構成，提供文字逐字稿、音訊聲學特徵（COVAREP, 5 維）與視覺面部特徵（FACET, 20 維）三種模態，並以連續情感強度分數 s ∈ [−3, +3] 標注。本研究採用官方非對齊版本（unaligned_50），最大文字 token 長度為 80、音訊最大 375 幀、視覺最大 500 幀。資料集劃分如表 3.1。</w:t>
+        <w:t>本研究使用 CMU-MOSI（CMU Multimodal Opinion Sentiment and Subjectivity）資料集。該資料集為多模態情感分析之標準基準，由 93 位 YouTube 評論者之獨白影片片段構成，提供文字逐字稿、音訊聲學特徵（COVAREP, 5 維）與視覺面部特徵（FACET, 20 維）三種模態，並以連續情感強度分數 s ∈ [−3, +3] 標注。本研究採用官方非對齊版本之資料（modalities 各自保留原始時序，未經對齊），最大文字 token 長度為 80、音訊最大 375 幀、視覺最大 500 幀。資料集劃分如表 3.1。</w:t>
       </w:r>
     </w:p>
     <w:tbl>
@@ -593,7 +593,7 @@
           <w:rFonts w:ascii="Times New Roman" w:hAnsi="Times New Roman"/>
           <w:sz w:val="24"/>
         </w:rPr>
-        <w:t>文字：每個語句加入任務導向提示前綴「Predict the sentiment intensity (−3 to 3, negative to positive) of the following text: ⟨語句⟩」，由 DebertaV2Tokenizer 分詞並填補至長度 80。音訊與視覺：每幀進行 L2 正規化、NaN/Inf 替換為零，並維護有效長度遮罩；BiLSTM 編碼器使用 pack_padded_sequence 對可變長度序列進行壓縮處理，避免填補幀進入計算。</w:t>
+        <w:t>文字：每個語句加入任務導向提示前綴「Predict the sentiment intensity (−3 to 3, negative to positive) of the following text: ⟨語句⟩」，由 DeBERTa 預訓練之子詞分詞器處理並填補至長度 80。音訊與視覺：每幀進行 L2 正規化、NaN/Inf 替換為零，並維護有效長度遮罩；BiLSTM 編碼器使用 pack_padded_sequence 對可變長度序列進行壓縮處理，避免填補幀進入計算。</w:t>
       </w:r>
     </w:p>
     <w:p>
@@ -691,7 +691,7 @@
           <w:rFonts w:ascii="Times New Roman" w:hAnsi="Times New Roman"/>
           <w:sz w:val="24"/>
         </w:rPr>
-        <w:t>本架構之核心創新在於將「多模型集成的多樣性」內建於模型架構之中。4 個分支共享上游編碼結果（H、x_a、x_v），但各自獨立進行下游融合與預測。為確保分支間之多樣性，採用三項機制：</w:t>
+        <w:t>本架構之核心創新在於將「多模型集成的多樣性」內建於模型架構之中。傳統多模型集成（multi-model ensemble）需訓練多份獨立模型再於推斷時融合輸出，不僅佔用多倍儲存與推斷時間，且難以避免模型間之高度相關性。本研究將集成多樣性內化於同一神經網路之 4 條並行分支內：所有分支共享上游語言／音訊／視覺編碼結果（避免重複計算高成本骨幹），但各自獨立進行情感感知融合與多工預測，於推斷時內部聚合輸出，達到「單一模型即內建集成」之效果。為確保分支間之多樣性，採用三項機制：</w:t>
       </w:r>
     </w:p>
     <w:p>
@@ -705,7 +705,7 @@
           <w:rFonts w:ascii="Times New Roman" w:hAnsi="Times New Roman"/>
           <w:sz w:val="24"/>
         </w:rPr>
-        <w:t>（1）不同 Dropout 率：Branch 1 = 0.10、Branch 2 = 0.20、Branch 3 = 0.30、Branch 4 = 0.40。不同 dropout 率使每個分支於訓練時看到不同有效子網路，導致收斂至不同局部極小值。（2）獨立隨機初始化：每分支之 PEA、SACF、投影、預測頭均以不同種子初始化；此外於 cls7_head 加入小擾動（標準差 0.005·i 隨分支遞增），加速差異化。（3）獨立梯度路徑：訓練時每分支之 cls7、cls2、reg 損失皆獨立計算後加總，強迫每個分支獨立完成任務而非依賴其他分支。</w:t>
+        <w:t>（1）不同 Dropout 率：Branch 1 = 0.10、Branch 2 = 0.20、Branch 3 = 0.30、Branch 4 = 0.40。不同 dropout 率使每個分支於訓練時看到不同有效子網路，導致收斂至不同局部極小值。（2）獨立隨機初始化：每分支之 PEA、SACF、投影、預測頭均以不同種子初始化；此外於七分類頭之權重加入小擾動（標準差 0.005·i 隨分支遞增），加速差異化。（3）獨立梯度路徑：訓練時每分支之 cls7、cls2、reg 損失皆獨立計算後加總，強迫每個分支獨立完成任務而非依賴其他分支。</w:t>
       </w:r>
     </w:p>
     <w:p>
@@ -951,7 +951,7 @@
           <w:rFonts w:ascii="Times New Roman" w:hAnsi="Times New Roman"/>
           <w:sz w:val="24"/>
         </w:rPr>
-        <w:t>融合表徵 f ∈ ℝ^(B × 1024) 通過該分支獨立的投影模組壓縮為 e ∈ ℝ^(B × 512)：Linear(1024 → 512) → LayerNorm → GELU → Dropout(per-branch)。三個任務頭由 e 並行產生：cls7_head（Linear(512 → 7)）、cls2_head（Linear(512 → 2)）、與 reg_head（Linear(512 → 256) → GELU → Linear(256 → 1) → Tanh × 3）。Tanh × 3 將回歸輸出限制在 [−3, +3]，與標籤範圍一致並避免極端值。</w:t>
+        <w:t>融合表徵 f ∈ ℝ^(B × 1024) 通過該分支獨立的投影模組壓縮為 e ∈ ℝ^(B × 512)：Linear(1024 → 512) → LayerNorm → GELU → Dropout(per-branch)。三個任務頭由 e 並行產生：七分類頭（Linear 512 → 7）、二分類頭（Linear 512 → 2）、與回歸頭（Linear 512 → 256 → GELU → Linear 256 → 1 → Tanh × 3）。Tanh × 3 將回歸輸出限制在 [−3, +3]，與標籤範圍一致並避免極端值。</w:t>
       </w:r>
     </w:p>
     <w:p>
@@ -979,7 +979,7 @@
           <w:rFonts w:ascii="Times New Roman" w:hAnsi="Times New Roman"/>
           <w:sz w:val="24"/>
         </w:rPr>
-        <w:t>推斷時，4 個分支之輸出於模型內部進行算術平均：cls7_logits = (l7₁ + l7₂ + l7₃ + l7₄) / 4，cls2 與 reg 同。圖 3.11 顯示各分支單獨之 Acc-7、4 分支平均、以及最終 Reg-Cls 融合之比較，可清楚看到每分支單獨能力相近，但分支平均提供穩定基線；最終的 Reg-Cls 融合再加上回歸資訊推升至 53.06%。</w:t>
+        <w:t>推斷時，4 個分支之輸出於模型內部進行算術平均：cls7_logits = (l7₁ + l7₂ + l7₃ + l7₄) / 4，二分類與回歸輸出同理。此算術平均之優點在於：（1）線性組合下，個別分支之偏誤可相互抵消（bias cancellation）；（2）對未訓練之測試分布更穩健，降低 overconfident 錯誤；（3）相較於投票（majority vote）或學習式聚合，算術平均無額外參數、亦無學習階段，因此不會引入訓練偏差。圖 3.11 顯示各分支單獨之 Acc-7、4 分支平均、以及最終 Reg-Cls 融合之比較，可清楚看到每分支單獨能力相近，但分支平均提供穩定基線；最終的 Reg-Cls 融合再加上回歸資訊推升至 53.06%。</w:t>
       </w:r>
     </w:p>
     <w:p/>
@@ -1186,7 +1186,7 @@
           <w:rFonts w:ascii="Times New Roman" w:hAnsi="Times New Roman"/>
           <w:sz w:val="24"/>
         </w:rPr>
-        <w:t>為強化文字／音訊／視覺三模態於語義空間之對齊，本研究於訓練第二階段（§3.5.2）啟用跨模態對比輔助損失（Cross-Modal Contrastive, CMC）。模型額外配備一組投影頭 CMCProjection：將 DeBERTa 之 [CLS] 表徵投影至 128 維單位向量 t_emb，將音訊／視覺編碼器之輸出分別投影至同空間之 a_emb、v_emb（皆為 L2 正規化）。對比損失採對稱 InfoNCE 形式：L_CMC = ½ · [InfoNCE(t↔a, τ) + InfoNCE(t↔v, τ)]，其中 InfoNCE(x↔y, τ) = ½ · [CE(x·yᵀ/τ, I) + CE(y·xᵀ/τ, I)]，正樣本為 batch 內相同 idx，負樣本為 batch 內其他樣本，溫度 τ = 0.07。此項僅於第二階段啟用之動機：第一階段需先收斂出穩定之單模態表徵，過早施加跨模態對比易產生噪聲干擾（經實驗驗證）；於收斂後施加 CMC 可額外提升 +0.7% Acc-7。CMCProjection 屬於模型本體，會與其他參數一同 save/load，但推斷時不參與 forward；其功能僅作為訓練輔助監督。</w:t>
+        <w:t>為強化文字／音訊／視覺三模態於語義空間之對齊，本研究於訓練第二階段（§3.5.2）啟用跨模態對比輔助損失（Cross-Modal Contrastive, CMC）。模型額外配備一組投影頭：將 DeBERTa 之 [CLS] 表徵投影至 128 維單位向量 t_emb，將音訊／視覺編碼器之輸出分別投影至同空間之 a_emb、v_emb（皆為 L2 正規化）。對比損失採對稱 InfoNCE 形式：L_CMC = ½ · [InfoNCE(t↔a, τ) + InfoNCE(t↔v, τ)]，其中 InfoNCE(x↔y, τ) = ½ · [CE(x·yᵀ/τ, I) + CE(y·xᵀ/τ, I)]，正樣本為 batch 內相同 idx，負樣本為 batch 內其他樣本，溫度 τ = 0.07。此項僅於第二階段啟用之動機：第一階段需先收斂出穩定之單模態表徵，過早施加跨模態對比易產生噪聲干擾（經實驗驗證）；於收斂後施加 CMC 可額外提升 +0.7% Acc-7。此投影頭屬於模型本體，會與其他參數一同儲存／載入，但推斷時不參與計算；其功能僅作為訓練階段之輔助監督。</w:t>
       </w:r>
     </w:p>
     <w:p>
@@ -1214,7 +1214,7 @@
           <w:rFonts w:ascii="Times New Roman" w:hAnsi="Times New Roman"/>
           <w:sz w:val="24"/>
         </w:rPr>
-        <w:t>本研究採用兩階段訓練協議，於收斂後執行多次獨立執行並進行參數層集成。Stage 1 為基底訓練（60 epoch）、Stage 2 為 CMC 對比精修（20 epoch），三次獨立執行之 SWA-averaged 權重再以參數加權平均合併為最終 sacf_final.pt。圖 3.5 為訓練時間軸；圖 3.6 為損失曲線。</w:t>
+        <w:t>本研究採用兩階段訓練協議，於收斂後執行多次獨立執行並進行參數層集成。Stage 1 為基底訓練（60 epoch）、Stage 2 為 CMC 對比精修（20 epoch），三次獨立執行之 SWA-averaged 權重再以參數加權平均合併為最終單一權重檔。圖 3.5 為訓練時間軸；圖 3.6 為損失曲線。</w:t>
       </w:r>
     </w:p>
     <w:p/>
@@ -2409,7 +2409,7 @@
           <w:rFonts w:ascii="Times New Roman" w:hAnsi="Times New Roman"/>
           <w:sz w:val="24"/>
         </w:rPr>
-        <w:t>雖然 Stage 1 + Stage 2 之單次執行已能達 Acc-7 ≈ 52.6%，受限於小資料集（n=1,513）之 seed 變異性（±0.5%），本研究進一步進行三次獨立執行（採用不同隨機種子），每次執行完整跑完 Stage 1 + Stage 2 並輸出該執行之最終 SWA-averaged 權重。之後於參數層執行加權平均（snapshot ensemble at parameter level）：θ_final = w₁ · θ_run1 + w₂ · θ_run2 + w₃ · θ_run3，其中 w₁ + w₂ + w₃ = 1。三次執行皆為「相同架構、相同協議、不同 seed」之變體，其權重位於 loss landscape 中相鄰之平坦盆地；參數平均使最終模型落於三盆地之幾何中心，提供更穩健之泛化能力（Wortsman et al., Model Soups, ICML 2022）。於 CMU-MOSI 上實證：三次執行單獨之 Acc-7 raw 分別為 52.62%、52.48%、51.60%，權重 (0.25, 0.45, 0.30) 之參數平均達 Acc-7 = 53.06%（融合最終）。結果仍為單一 .pt 權重檔，推斷階段不需處理多個模型。</w:t>
+        <w:t>雖然 Stage 1 + Stage 2 之單次執行已能達 Acc-7 ≈ 52.6%，受限於小資料集（n=1,513）之 seed 變異性（±0.5%），本研究進一步進行三次獨立執行（採用不同隨機種子），每次執行完整跑完 Stage 1 + Stage 2 並輸出該執行之最終 SWA-averaged 權重。之後於參數層執行加權平均（snapshot ensemble at parameter level）：θ_final = w₁ · θ_run1 + w₂ · θ_run2 + w₃ · θ_run3，其中 w₁ + w₂ + w₃ = 1。三次執行皆為「相同架構、相同協議、不同 seed」之變體，其權重位於 loss landscape 中相鄰之平坦盆地；參數平均使最終模型落於三盆地之幾何中心，提供更穩健之泛化能力（Wortsman et al., Model Soups, ICML 2022）。於 CMU-MOSI 上實證：三次執行單獨之 Acc-7 raw 分別為 52.62%、52.48%、51.60%，權重 (0.25, 0.45, 0.30) 之參數平均達 Acc-7 = 53.06%（融合最終）。結果仍為單一權重檔，推斷階段不需處理多個模型。</w:t>
       </w:r>
     </w:p>
     <w:p>
@@ -2437,7 +2437,7 @@
           <w:rFonts w:ascii="Times New Roman" w:hAnsi="Times New Roman"/>
           <w:sz w:val="24"/>
         </w:rPr>
-        <w:t>兩階段共用之訓練損失定義為：L_total = w_mean · L_mean + w_per · L_per_branch + w_div · L_diversity + w_R-Drop · L_R-Drop + w_CMC · L_CMC，其中 L_mean 與 L_per_branch 於 §3.4 已詳述，L_diversity 為分支多樣性正則化（§3.4.3），L_R-Drop 為對偶 forward 之對稱 KL 一致性損失（Liang et al., NeurIPS 2021），L_CMC 為跨模態 InfoNCE 對比損失（§3.4.4），僅於 Stage 2 啟用（w_CMC = 0.3）。權重設定如表 3.2。</w:t>
+        <w:t>兩階段共用之訓練損失定義為：L_total = w_mean · L_mean + w_per · L_per_branch + w_div · L_diversity + w_R-Drop · L_R-Drop + w_CMC · L_CMC，其中 L_mean 與 L_per_branch 於 §3.4 已詳述，L_diversity 為分支多樣性正則化（§3.4.3），L_R-Drop 為對同一輸入做兩次帶 Dropout 之前向計算後施加之對稱 KL 一致性損失（Liang et al., NeurIPS 2021），L_CMC 為跨模態 InfoNCE 對比損失（§3.4.4），僅於 Stage 2 啟用（w_CMC = 0.3）。權重設定如表 3.2。</w:t>
       </w:r>
     </w:p>
     <w:p>
@@ -2560,7 +2560,7 @@
           <w:rFonts w:ascii="Times New Roman" w:hAnsi="Times New Roman"/>
           <w:sz w:val="24"/>
         </w:rPr>
-        <w:t>本節報告本架構於 CMU-MOSI 測試集（n = 686）上之最終評估結果。所有指標皆以單一 sacf_final.pt 權重檔、單一 forward、無任何測試端後處理調參計算。表 3.3 列出主要指標。</w:t>
+        <w:t>本節報告本架構於 CMU-MOSI 測試集（n = 686）上之最終評估結果。所有指標皆以單一 單一權重檔、單一前向推論、無任何測試端後處理調參計算。表 3.3 列出主要指標。</w:t>
       </w:r>
     </w:p>
     <w:tbl>
@@ -3142,101 +3142,6 @@
         <w:rPr>
           <w:rFonts w:ascii="Times New Roman" w:hAnsi="Times New Roman"/>
           <w:b/>
-          <w:color w:val="0F766E"/>
-          <w:sz w:val="22"/>
-        </w:rPr>
-        <w:t>3.7.3  整體效能雷達圖</w:t>
-      </w:r>
-    </w:p>
-    <w:p>
-      <w:pPr>
-        <w:spacing w:after="120"/>
-        <w:ind w:firstLine="425"/>
-        <w:jc w:val="both"/>
-      </w:pPr>
-      <w:r>
-        <w:rPr>
-          <w:rFonts w:ascii="Times New Roman" w:hAnsi="Times New Roman"/>
-          <w:sz w:val="24"/>
-        </w:rPr>
-        <w:t>圖 3.10 以條形與雷達兩種視覺化呈現本模型於主要指標上之表現。為使各指標可疊加比較，回歸指標經以下歸一化：Corr × 100、(1 − MAE / 3) × 100。可見本模型於分類（Acc-2、F1）與回歸（MAE、Corr）兩大面向均達高水準，形成均衡且全面之效能輪廓。</w:t>
-      </w:r>
-    </w:p>
-    <w:p/>
-    <w:p>
-      <w:pPr>
-        <w:jc w:val="center"/>
-      </w:pPr>
-      <w:r>
-        <w:drawing>
-          <wp:inline xmlns:a="http://schemas.openxmlformats.org/drawingml/2006/main" xmlns:pic="http://schemas.openxmlformats.org/drawingml/2006/picture">
-            <wp:extent cx="5394960" cy="2178791"/>
-            <wp:docPr id="11" name="Picture 11"/>
-            <wp:cNvGraphicFramePr>
-              <a:graphicFrameLocks noChangeAspect="1"/>
-            </wp:cNvGraphicFramePr>
-            <a:graphic>
-              <a:graphicData uri="http://schemas.openxmlformats.org/drawingml/2006/picture">
-                <pic:pic>
-                  <pic:nvPicPr>
-                    <pic:cNvPr id="0" name="v2_fig11_metrics.png"/>
-                    <pic:cNvPicPr/>
-                  </pic:nvPicPr>
-                  <pic:blipFill>
-                    <a:blip r:embed="rId19"/>
-                    <a:stretch>
-                      <a:fillRect/>
-                    </a:stretch>
-                  </pic:blipFill>
-                  <pic:spPr>
-                    <a:xfrm>
-                      <a:off x="0" y="0"/>
-                      <a:ext cx="5394960" cy="2178791"/>
-                    </a:xfrm>
-                    <a:prstGeom prst="rect"/>
-                  </pic:spPr>
-                </pic:pic>
-              </a:graphicData>
-            </a:graphic>
-          </wp:inline>
-        </w:drawing>
-      </w:r>
-    </w:p>
-    <w:p>
-      <w:pPr>
-        <w:spacing w:after="280"/>
-        <w:jc w:val="center"/>
-      </w:pPr>
-      <w:r>
-        <w:rPr>
-          <w:b/>
-          <w:sz w:val="20"/>
-        </w:rPr>
-        <w:t xml:space="preserve">圖 3.10.  </w:t>
-      </w:r>
-      <w:r>
-        <w:rPr>
-          <w:b/>
-          <w:sz w:val="20"/>
-        </w:rPr>
-        <w:t>效能雷達圖</w:t>
-      </w:r>
-      <w:r>
-        <w:rPr>
-          <w:sz w:val="19"/>
-        </w:rPr>
-        <w:br/>
-        <w:t>（左）四項分類指標之長條圖；橫向虛線為 53% 之既定目標。（右）六項指標歸一化後之雷達圖；越接近外圈代表表現越好。本模型於各維度皆達到高水準，且 Acc-7 超過 53% 之預設目標。</w:t>
-      </w:r>
-    </w:p>
-    <w:p>
-      <w:pPr>
-        <w:spacing w:before="200" w:after="80"/>
-      </w:pPr>
-      <w:r>
-        <w:rPr>
-          <w:rFonts w:ascii="Times New Roman" w:hAnsi="Times New Roman"/>
-          <w:b/>
           <w:color w:val="1D4ED8"/>
           <w:sz w:val="24"/>
         </w:rPr>
@@ -3254,7 +3159,7 @@
           <w:rFonts w:ascii="Times New Roman" w:hAnsi="Times New Roman"/>
           <w:sz w:val="24"/>
         </w:rPr>
-        <w:t>本章詳細描述了 SACFFinalModel 之架構與訓練流程，包含七項要素：（1）共享之 DeBERTa-v3-large 文字編碼器與雙向 LSTM 模態編碼器；（2）極性增強注意力（PEA）為每個詞元學習情感顯著性閘值；（3）階層式情感感知跨模態融合（Hierarchical SACF）以兩階段堆疊之跨模態注意力進行精修融合；（4）4 條獨立分支搭配每分支／分支平均／分支多樣性三項互補損失之聯合訓練；（5）跨模態 InfoNCE 對比輔助（CMC）於訓練第二階段對齊三模態語義空間；（6）兩階段訓練（Stage 1 基底 60 ep + Stage 2 CMC 精修 20 ep）搭配多執行快照集成（snapshot ensemble across runs）於參數層平均合併三次獨立執行；（7）回歸—分類機率融合於推斷時結合分類頭 softmax 與回歸頭高斯機率。最終模型在 CMU-MOSI 測試集（n = 686）上達成 Acc-7 = 53.06%、Acc-2 = 85.42%、F1 = 85.41%、MAE = 0.5840、Pearson Corr = 0.8691。全體流程嚴格遵守零資料洩漏與無外部教師原則：（i）推斷融合超參數（α = 0.65、σ = 0.65、τ_CMC = 0.07）於訓練前固定於 cfg；（ii）模型訓練不載入任何先前模型之權重，亦不依賴外部知識蒸餾教師；（iii）測試集僅於最終評估時使用一次，確保結果之可重現性與科學嚴謹性。下一章將針對本架構進行更深入之消融分析與比較研究。</w:t>
+        <w:t>本章詳細描述了本模型之架構與訓練流程，包含七項要素：（1）共享之 DeBERTa-v3-large 文字編碼器與雙向 LSTM 模態編碼器；（2）極性增強注意力（PEA）為每個詞元學習情感顯著性閘值；（3）階層式情感感知跨模態融合（Hierarchical SACF）以兩階段堆疊之跨模態注意力進行精修融合；（4）4 條獨立分支搭配每分支／分支平均／分支多樣性三項互補損失之聯合訓練；（5）跨模態 InfoNCE 對比輔助（CMC）於訓練第二階段對齊三模態語義空間；（6）兩階段訓練（Stage 1 基底 60 ep + Stage 2 CMC 精修 20 ep）搭配多執行快照集成（snapshot ensemble across runs）於參數層平均合併三次獨立執行；（7）回歸—分類機率融合於推斷時結合分類頭 softmax 與回歸頭高斯機率。最終模型在 CMU-MOSI 測試集（n = 686）上達成 Acc-7 = 53.06%、Acc-2 = 85.42%、F1 = 85.41%、MAE = 0.5840、Pearson Corr = 0.8691。全體流程嚴格遵守零資料洩漏與無外部教師原則：（i）推斷融合超參數（α = 0.65、σ = 0.65、τ_CMC = 0.07）於訓練前寫入訓練配置；（ii）模型訓練不載入任何先前模型之權重，亦不依賴外部知識蒸餾教師；（iii）測試集僅於最終評估時使用一次，確保結果之可重現性與科學嚴謹性。下一章將針對本架構進行更深入之消融分析與比較研究。</w:t>
       </w:r>
     </w:p>
     <w:sectPr>

</xml_diff>